<commit_message>
Risk page: compare sensitivities on the same base, note the g=2.0% column, align lease term with source data
Co-Authored-By: Claude Sonnet 5.5 <noreply@anthropic.com>
Claude-Session: https://claude.ai/code/session_0188QZHBkA8n5QL7BtmFakQg
</commit_message>
<xml_diff>
--- a/informe/Mallplaza_Investment_Risks_EN.docx
+++ b/informe/Mallplaza_Investment_Risks_EN.docx
@@ -270,7 +270,7 @@
                 <w:sz w:val="16"/>
                 <w:szCs w:val="16"/>
               </w:rPr>
-              <w:t xml:space="preserve">long-term leases (average remaining term of 6.7 years) and a proven ability to convert anchor space into smaller stores with higher rent per m².</w:t>
+              <w:t xml:space="preserve">long-term leases (average remaining term of 7.1 years) and a proven ability to convert anchor space into smaller stores with higher rent per m².</w:t>
             </w:r>
           </w:p>
           <w:p>
@@ -805,7 +805,7 @@
                 <w:sz w:val="16"/>
                 <w:szCs w:val="16"/>
               </w:rPr>
-              <w:t xml:space="preserve">Value is more sensitive to the discount rate than to operations. The worst operating case, EBITDA margin, takes 10.0% off value (Figure 24), while +100 bp of WACC takes 12.3% off the target price (Figure 25). The current price implies a cap rate close to 6.0%, versus 10.1% in the DCF: the market prices in a low discount rate, which increases the stock's exposure to higher rates. A higher g lowers value because RONIC (5.0%) is below the real WACC (7.2%). Even the best cell in Figure 25 (CLP 2,487) is below the CLP 3,555 share price, so the recommendation stands.</w:t>
+              <w:t xml:space="preserve">Value is more sensitive to the discount rate than to operations. The worst operating case, EBITDA margin, takes 10.0% off DCF value (Figure 24), while +100 bp of WACC takes 17.2% off (12.3% of the target price, Figure 25). The current price implies a cap rate close to 6.0%, versus 10.1% in the DCF: the market prices in a low discount rate, which increases the stock's exposure to higher rates. A higher g lowers value because RONIC (5.0%) is below the real WACC (7.2%). Even the best cell in Figure 25 (CLP 2,487) is below the CLP 3,555 share price, so the recommendation stands.</w:t>
             </w:r>
           </w:p>
         </w:tc>
@@ -1094,7 +1094,7 @@
                 <w:sz w:val="11"/>
                 <w:szCs w:val="11"/>
               </w:rPr>
-              <w:t xml:space="preserve">Target price = 80% DCF + 20% EV/EBITDA multiples (CLP 2,951). Source: Team analysis.</w:t>
+              <w:t xml:space="preserve">Target price = 80% DCF + 20% EV/EBITDA multiples (CLP 2,951). The g = 2.0% column uses the same formula as the Sensibilidad sheet. Source: Team analysis.</w:t>
             </w:r>
           </w:p>
           <w:p>

</xml_diff>

<commit_message>
Update the Investment Risks page: matrix per text, UF target-price sensitivity, political context table
Co-Authored-By: Claude Opus 5.5 <noreply@anthropic.com>
Claude-Session: https://claude.ai/code/session_0188QZHBkA8n5QL7BtmFakQg
</commit_message>
<xml_diff>
--- a/informe/Mallplaza_Investment_Risks_EN.docx
+++ b/informe/Mallplaza_Investment_Risks_EN.docx
@@ -34,7 +34,7 @@
           <w:sz w:val="16"/>
           <w:szCs w:val="16"/>
         </w:rPr>
-        <w:t xml:space="preserve">Mallplaza's risk profile is moderate: its operations are resilient and value depends mainly on market variables. The main risk is a high-probability rise in interest rates that lifts the WACC, followed by inflation and weaker macro momentum. None of the risks analysed takes the target price above the current share price.</w:t>
+        <w:t xml:space="preserve">Mallplaza's risk profile is moderate: its operations are resilient and value depends mainly on market variables. The main risk, with high likelihood, is a rise in long-term rates, which pushes up bond yields and the WACC; it is followed by inflation and weaker macro momentum. Not even the favourable scenarios justify the market price at the report date.</w:t>
       </w:r>
     </w:p>
     <w:tbl>
@@ -103,7 +103,7 @@
                 <w:sz w:val="16"/>
                 <w:szCs w:val="16"/>
               </w:rPr>
-              <w:t xml:space="preserve">Figure 23 places each risk in a 3x3 matrix by likelihood and impact (low, medium, high); the colour of each label shows its category. Impact is measured as the effect on value per share, using the operational tornado (Figure 24), the WACC and g sensitivity (Figure 25) and the effect of UF indexation (Figure 26). Interest-rate risk (FR1) sits in the most severe cell (high/high), and inflation and the macro cycle (MR1) also fall in the red zone; FX (MR3) sits in the centre.</w:t>
+              <w:t xml:space="preserve">Figure 23 places each risk in a 3x3 matrix by likelihood and impact (low, medium, high); the colour of each label shows its category. Impact is measured as the effect on value per share, using the operational tornado (Figure 24), the WACC and g sensitivity (Figure 25) and the UF sensitivity (Figure 26). Risks that could not be quantified with the model (RR1 and RR2) are placed according to the team's qualitative analysis. Interest-rate risk (FR1) sits in the most severe cell (high/high), and inflation and the macro cycle (MR1) also fall in the red zone; operating deterioration (OR1) and FX (MR3) sit in the centre.</w:t>
             </w:r>
           </w:p>
           <w:p>
@@ -170,7 +170,7 @@
                 <w:sz w:val="16"/>
                 <w:szCs w:val="16"/>
               </w:rPr>
-              <w:t xml:space="preserve">(Non‑systematic · Medium likelihood · Low impact)</w:t>
+              <w:t xml:space="preserve">(Non‑systematic · Medium likelihood · Medium impact)</w:t>
             </w:r>
           </w:p>
           <w:p>
@@ -233,7 +233,7 @@
                 <w:sz w:val="16"/>
                 <w:szCs w:val="16"/>
               </w:rPr>
-              <w:t xml:space="preserve">Anchors, mostly from the Falabella group, drive footfall. Shrinking or losing them would lower visits and rents from smaller stores. In 2025 Mallplaza already converted 14,000 m² of large-format space in five malls. The impact is bounded by the traffic and rent bars of the tornado (−1.3% to −4.0%, Figure 24). </w:t>
+              <w:t xml:space="preserve">Anchors, mostly from the Falabella group, drive footfall. Shrinking or losing them would lower visits and rents from smaller stores. The impact ranges from −1.3% to −4.0% (Figure 24). </w:t>
             </w:r>
             <w:r>
               <w:rPr>
@@ -244,7 +244,7 @@
                 <w:sz w:val="16"/>
                 <w:szCs w:val="16"/>
               </w:rPr>
-              <w:t xml:space="preserve">(Non‑systematic · Low likelihood · Medium impact)</w:t>
+              <w:t xml:space="preserve">(Non‑systematic · Low likelihood · Low impact)</w:t>
             </w:r>
           </w:p>
           <w:p>
@@ -419,7 +419,7 @@
                 <w:sz w:val="16"/>
                 <w:szCs w:val="16"/>
               </w:rPr>
-              <w:t xml:space="preserve">79% of debt is in UF: a 3% higher UF (base case) takes CLP 38,691 million off earnings (Figure 26). Weaker consumption hurts tenant sales and, without GDP growth, the new business lines Mallplaza has captured do not emerge (Appendix [X]). </w:t>
+              <w:t xml:space="preserve">79% of debt is in UF: a 3% higher UF takes CLP 38,691 million off accounting earnings (Note 26). On the target price, however, the effect is slightly positive: indexed rents add CLP 40.8 per share and the higher UF debt subtracts 17.7, a net +23.1 (+1.1%) (Figure 26). The risk is that weaker consumption prevents passing the UF through to rents: without that pass-through, UF +3% takes 0.9% off the target price. Weaker consumption also slows the new business lines (Appendix [X]). </w:t>
             </w:r>
             <w:r>
               <w:rPr>
@@ -567,7 +567,7 @@
                 <w:sz w:val="16"/>
                 <w:szCs w:val="16"/>
               </w:rPr>
-              <w:t xml:space="preserve">Around 28% of revenue comes from Peru and Colombia, and the model assumes the sol rises from CLP 268 to 290 between 2026 and 2031. A weaker PEN or COP would lower consolidated revenue and EBITDA in pesos. </w:t>
+              <w:t xml:space="preserve">Around 28% of revenue comes from Peru and Colombia, and the model assumes the sol rises from CLP 268 to 290 between 2026 and 2031. A 10% depreciation of the PEN and COP from 2027E takes 4.3% off DCF value, before hedges and the effect on local-currency debt (team estimate). </w:t>
             </w:r>
             <w:r>
               <w:rPr>
@@ -734,7 +734,7 @@
                 <w:sz w:val="16"/>
                 <w:szCs w:val="16"/>
               </w:rPr>
-              <w:t xml:space="preserve">Changes to corporate tax and permitting create uncertainty when evaluating pipeline projects (USD 613 million, 170,200 m² to 2028). Permit delays push back revenue, although the value sensitivity is limited. </w:t>
+              <w:t xml:space="preserve">All three governments took office in 2026 with pro-investment agendas, but with different fiscal and legislative room (see Political and economic context): in Chile the corporate tax cut is already law, in Peru the government lacks its own majority, and in Colombia fiscal tightening and high rates weigh on consumption. Permit delays push back pipeline revenue (USD 613 million, 170,200 m² to 2028), with limited value sensitivity. </w:t>
             </w:r>
             <w:r>
               <w:rPr>
@@ -771,41 +771,7 @@
                 <w:sz w:val="16"/>
                 <w:szCs w:val="16"/>
               </w:rPr>
-              <w:t xml:space="preserve">pro-market governments in all three countries (Kast, Fujimori, De La Espriella). Law 21,770 shortens permitting times, and the Reconstruction Law cuts corporate tax from 27% to 23% in 2029 (the model uses 27%).</w:t>
-            </w:r>
-          </w:p>
-          <w:p>
-            <w:pPr>
-              <w:pBdr>
-                <w:bottom w:val="single" w:color="E9004B" w:sz="8" w:space="1"/>
-              </w:pBdr>
-              <w:spacing w:after="50" w:before="110"/>
-            </w:pPr>
-            <w:r>
-              <w:rPr>
-                <w:rFonts w:ascii="Arial" w:cs="Arial" w:eastAsia="Arial" w:hAnsi="Arial"/>
-                <w:b/>
-                <w:bCs/>
-                <w:color w:val="14284B"/>
-                <w:sz w:val="16"/>
-                <w:szCs w:val="16"/>
-              </w:rPr>
-              <w:t xml:space="preserve">SENSITIVITY ANALYSIS</w:t>
-            </w:r>
-          </w:p>
-          <w:p>
-            <w:pPr>
-              <w:spacing w:after="40" w:before="0" w:line="228" w:lineRule="auto"/>
-              <w:jc w:val="both"/>
-            </w:pPr>
-            <w:r>
-              <w:rPr>
-                <w:rFonts w:ascii="Arial" w:cs="Arial" w:eastAsia="Arial" w:hAnsi="Arial"/>
-                <w:color w:val="1A1A1A"/>
-                <w:sz w:val="16"/>
-                <w:szCs w:val="16"/>
-              </w:rPr>
-              <w:t xml:space="preserve">Value is more sensitive to the discount rate than to operations. The worst operating case, EBITDA margin, takes 10.0% off DCF value (Figure 24), while +100 bp of WACC takes 17.2% off (12.3% of the target price, Figure 25). The current price implies a cap rate close to 6.0%, versus 10.1% in the DCF: the market prices in a low discount rate, which increases the stock's exposure to higher rates. A higher g lowers value because RONIC (5.0%) is below the real WACC (7.2%). Even the best cell in Figure 25 (CLP 2,487) is below the CLP 3,555 share price, so the recommendation stands.</w:t>
+              <w:t xml:space="preserve">Law 21,770 (Sep-25) shortens permitting times and Colombia contributes only ~11% of revenue. The model keeps 27%: applying the cut to the Chilean share would lift DCF value ~5.4% (+3.9% on the target price), still far from the market price.</w:t>
             </w:r>
           </w:p>
         </w:tc>
@@ -1010,7 +976,7 @@
                 <w:sz w:val="11"/>
                 <w:szCs w:val="11"/>
               </w:rPr>
-              <w:t xml:space="preserve">Limits = historical low and high of each driver: Mallplaza earnings releases 4Q23–2Q26 (EBITDA margin, occupancy, same-store rent and sales, visitors) and financial statements (maintenance capex 2024 and LTM 2Q26; appraisal growth range, Note 11). terminal WACC 10.41% and g 3.0% held constant. Source: Mallplaza; Team analysis.</w:t>
+              <w:t xml:space="preserve">Limits = historical low and high of each driver: Mallplaza earnings releases 4Q23–2Q26 (EBITDA margin, occupancy, same-store rent and sales, visitors) and financial statements (maintenance capex 2024 and LTM 2Q26; appraisal growth range, Note 11). Terminal WACC 10.41% and g 3.0% held constant. Source: Mallplaza; Team analysis.</w:t>
             </w:r>
           </w:p>
           <w:p>
@@ -1097,9 +1063,124 @@
               <w:t xml:space="preserve">Target price = 80% DCF + 20% EV/EBITDA multiples (CLP 2,951). The g = 2.0% column uses the same formula as the Sensibilidad sheet. Source: Team analysis.</w:t>
             </w:r>
           </w:p>
-          <w:p>
-            <w:pPr>
-              <w:spacing w:after="30" w:before="100" w:line="228" w:lineRule="auto"/>
+        </w:tc>
+      </w:tr>
+    </w:tbl>
+    <w:p>
+      <w:pPr>
+        <w:pageBreakBefore/>
+        <w:spacing w:after="0" w:before="0"/>
+      </w:pPr>
+    </w:p>
+    <w:tbl>
+      <w:tblPr>
+        <w:tblW w:type="dxa" w:w="10666"/>
+        <w:tblBorders>
+          <w:top w:val="none" w:color="FFFFFF" w:sz="0"/>
+          <w:left w:val="none" w:color="FFFFFF" w:sz="0"/>
+          <w:bottom w:val="none" w:color="FFFFFF" w:sz="0"/>
+          <w:right w:val="none" w:color="FFFFFF" w:sz="0"/>
+          <w:insideH w:val="none" w:color="FFFFFF" w:sz="0"/>
+          <w:insideV w:val="none" w:color="FFFFFF" w:sz="0"/>
+        </w:tblBorders>
+      </w:tblPr>
+      <w:tblGrid>
+        <w:gridCol w:w="6900"/>
+        <w:gridCol w:w="216"/>
+        <w:gridCol w:w="3550"/>
+      </w:tblGrid>
+      <w:tr>
+        <w:tc>
+          <w:tcPr>
+            <w:tcW w:type="dxa" w:w="6900"/>
+            <w:tcBorders>
+              <w:top w:val="none" w:color="FFFFFF" w:sz="0"/>
+              <w:left w:val="none" w:color="FFFFFF" w:sz="0"/>
+              <w:bottom w:val="none" w:color="FFFFFF" w:sz="0"/>
+              <w:right w:val="none" w:color="FFFFFF" w:sz="0"/>
+            </w:tcBorders>
+            <w:tcMar>
+              <w:top w:type="dxa" w:w="0"/>
+              <w:left w:type="dxa" w:w="0"/>
+              <w:bottom w:type="dxa" w:w="0"/>
+              <w:right w:type="dxa" w:w="0"/>
+            </w:tcMar>
+            <w:vAlign w:val="top"/>
+          </w:tcPr>
+          <w:p>
+            <w:pPr>
+              <w:pBdr>
+                <w:bottom w:val="single" w:color="E9004B" w:sz="8" w:space="1"/>
+              </w:pBdr>
+              <w:spacing w:after="50" w:before="110"/>
+            </w:pPr>
+            <w:r>
+              <w:rPr>
+                <w:rFonts w:ascii="Arial" w:cs="Arial" w:eastAsia="Arial" w:hAnsi="Arial"/>
+                <w:b/>
+                <w:bCs/>
+                <w:color w:val="14284B"/>
+                <w:sz w:val="16"/>
+                <w:szCs w:val="16"/>
+              </w:rPr>
+              <w:t xml:space="preserve">SENSITIVITY ANALYSIS</w:t>
+            </w:r>
+          </w:p>
+          <w:p>
+            <w:pPr>
+              <w:spacing w:after="40" w:before="0" w:line="228" w:lineRule="auto"/>
+              <w:jc w:val="both"/>
+            </w:pPr>
+            <w:r>
+              <w:rPr>
+                <w:rFonts w:ascii="Arial" w:cs="Arial" w:eastAsia="Arial" w:hAnsi="Arial"/>
+                <w:color w:val="1A1A1A"/>
+                <w:sz w:val="16"/>
+                <w:szCs w:val="16"/>
+              </w:rPr>
+              <w:t xml:space="preserve">Value is more sensitive to the discount rate than to operations in the scenarios assessed. The worst operating case, EBITDA margin, takes 10.0% off DCF value (Figure 24), while +100 bp of WACC takes 17.2% off (12.3% of the target price, Figure 25). The current price implies a cap rate close to 6.0%, versus 10.1% in the DCF: the market prices in a low discount rate, which increases the stock's exposure to higher rates. A higher g lowers value because RONIC (5.0%) is below the real WACC (7.2%). The UF barely moves value (+1.1% with UF +3%), as indexed rents offset UF debt. Even the best cell in Figure 25 (CLP 2,487) is below the CLP 3,555 share price, so the recommendation stands.</w:t>
+            </w:r>
+          </w:p>
+        </w:tc>
+        <w:tc>
+          <w:tcPr>
+            <w:tcW w:type="dxa" w:w="216"/>
+            <w:tcBorders>
+              <w:top w:val="none" w:color="FFFFFF" w:sz="0"/>
+              <w:left w:val="none" w:color="FFFFFF" w:sz="0"/>
+              <w:bottom w:val="none" w:color="FFFFFF" w:sz="0"/>
+              <w:right w:val="none" w:color="FFFFFF" w:sz="0"/>
+            </w:tcBorders>
+            <w:tcMar>
+              <w:top w:type="dxa" w:w="0"/>
+              <w:left w:type="dxa" w:w="0"/>
+              <w:bottom w:type="dxa" w:w="0"/>
+              <w:right w:type="dxa" w:w="0"/>
+            </w:tcMar>
+            <w:vAlign w:val="top"/>
+          </w:tcPr>
+          <w:p/>
+        </w:tc>
+        <w:tc>
+          <w:tcPr>
+            <w:tcW w:type="dxa" w:w="3550"/>
+            <w:tcBorders>
+              <w:top w:val="none" w:color="FFFFFF" w:sz="0"/>
+              <w:left w:val="none" w:color="FFFFFF" w:sz="0"/>
+              <w:bottom w:val="none" w:color="FFFFFF" w:sz="0"/>
+              <w:right w:val="none" w:color="FFFFFF" w:sz="0"/>
+            </w:tcBorders>
+            <w:tcMar>
+              <w:top w:type="dxa" w:w="0"/>
+              <w:left w:type="dxa" w:w="0"/>
+              <w:bottom w:type="dxa" w:w="0"/>
+              <w:right w:type="dxa" w:w="0"/>
+            </w:tcMar>
+            <w:vAlign w:val="top"/>
+          </w:tcPr>
+          <w:p>
+            <w:pPr>
+              <w:spacing w:after="30" w:before="40" w:line="228" w:lineRule="auto"/>
             </w:pPr>
             <w:r>
               <w:rPr>
@@ -1119,7 +1200,7 @@
                 <w:sz w:val="14"/>
                 <w:szCs w:val="14"/>
               </w:rPr>
-              <w:t xml:space="preserve">Earnings sensitivity to a rise in the UF</w:t>
+              <w:t xml:space="preserve">Target price sensitivity to a rise in the UF (CLP per share)</w:t>
             </w:r>
           </w:p>
           <w:p>
@@ -1129,7 +1210,7 @@
             <w:r>
               <w:drawing>
                 <wp:inline distT="0" distB="0" distL="0" distR="0">
-                  <wp:extent cx="2257425" cy="1190625"/>
+                  <wp:extent cx="2257425" cy="1371600"/>
                   <wp:effectExtent t="0" r="0" b="0" l="0"/>
                   <wp:docPr id="1" name="" descr="" title=""/>
                   <wp:cNvGraphicFramePr>
@@ -1154,7 +1235,7 @@
                         <pic:spPr bwMode="auto">
                           <a:xfrm>
                             <a:off x="0" y="0"/>
-                            <a:ext cx="2257425" cy="1190625"/>
+                            <a:ext cx="2257425" cy="1371600"/>
                           </a:xfrm>
                           <a:prstGeom prst="rect">
                             <a:avLst/>
@@ -1178,12 +1259,755 @@
                 <w:sz w:val="11"/>
                 <w:szCs w:val="11"/>
               </w:rPr>
-              <w:t xml:space="preserve">+3% = reported sensitivity; +1% and +2% linear extrapolation. Source: Mallplaza financial statements Jun-26, Note 26.</w:t>
+              <w:t xml:space="preserve">UF level shock from 2027E, with WACC and g constant. Rents: model's Chile CPI (80% of the target price via DCF); debt: net UF exposure implied by Note 26 (CLP 1.29 trillion). Earnings: +3% reported, +1% and +2% linear extrapolation. Source: Mallplaza financial statements Jun-26, Note 26; Team analysis.</w:t>
             </w:r>
           </w:p>
         </w:tc>
       </w:tr>
     </w:tbl>
+    <w:p>
+      <w:pPr>
+        <w:pBdr>
+          <w:bottom w:val="single" w:color="E9004B" w:sz="8" w:space="1"/>
+        </w:pBdr>
+        <w:spacing w:after="50" w:before="110"/>
+      </w:pPr>
+      <w:r>
+        <w:rPr>
+          <w:rFonts w:ascii="Arial" w:cs="Arial" w:eastAsia="Arial" w:hAnsi="Arial"/>
+          <w:b/>
+          <w:bCs/>
+          <w:color w:val="14284B"/>
+          <w:sz w:val="16"/>
+          <w:szCs w:val="16"/>
+        </w:rPr>
+        <w:t xml:space="preserve">POLITICAL AND ECONOMIC CONTEXT 2026</w:t>
+      </w:r>
+    </w:p>
+    <w:tbl>
+      <w:tblPr>
+        <w:tblW w:type="dxa" w:w="10666"/>
+        <w:tblBorders>
+          <w:top w:val="single" w:color="auto" w:sz="4"/>
+          <w:left w:val="single" w:color="auto" w:sz="4"/>
+          <w:bottom w:val="single" w:color="auto" w:sz="4"/>
+          <w:right w:val="single" w:color="auto" w:sz="4"/>
+          <w:insideH w:val="single" w:color="auto" w:sz="4"/>
+          <w:insideV w:val="single" w:color="auto" w:sz="4"/>
+        </w:tblBorders>
+      </w:tblPr>
+      <w:tblGrid>
+        <w:gridCol w:w="1300"/>
+        <w:gridCol w:w="1700"/>
+        <w:gridCol w:w="4250"/>
+        <w:gridCol w:w="3416"/>
+      </w:tblGrid>
+      <w:tr>
+        <w:trPr>
+          <w:tblHeader/>
+        </w:trPr>
+        <w:tc>
+          <w:tcPr>
+            <w:tcW w:type="dxa" w:w="1300"/>
+            <w:tcBorders>
+              <w:top w:val="single" w:color="D5D9E0" w:sz="4"/>
+              <w:left w:val="none" w:color="FFFFFF" w:sz="0"/>
+              <w:bottom w:val="single" w:color="D5D9E0" w:sz="4"/>
+              <w:right w:val="none" w:color="FFFFFF" w:sz="0"/>
+            </w:tcBorders>
+            <w:shd w:fill="14284B" w:color="auto" w:val="clear"/>
+            <w:tcMar>
+              <w:top w:type="dxa" w:w="40"/>
+              <w:left w:type="dxa" w:w="70"/>
+              <w:bottom w:type="dxa" w:w="40"/>
+              <w:right w:type="dxa" w:w="70"/>
+            </w:tcMar>
+            <w:vAlign w:val="top"/>
+          </w:tcPr>
+          <w:p>
+            <w:pPr>
+              <w:spacing w:after="0" w:before="0" w:line="216" w:lineRule="auto"/>
+              <w:jc w:val="left"/>
+            </w:pPr>
+            <w:r>
+              <w:rPr>
+                <w:rFonts w:ascii="Arial" w:cs="Arial" w:eastAsia="Arial" w:hAnsi="Arial"/>
+                <w:b/>
+                <w:bCs/>
+                <w:color w:val="FFFFFF"/>
+                <w:sz w:val="14"/>
+                <w:szCs w:val="14"/>
+              </w:rPr>
+              <w:t xml:space="preserve">Country</w:t>
+            </w:r>
+          </w:p>
+        </w:tc>
+        <w:tc>
+          <w:tcPr>
+            <w:tcW w:type="dxa" w:w="1700"/>
+            <w:tcBorders>
+              <w:top w:val="single" w:color="D5D9E0" w:sz="4"/>
+              <w:left w:val="none" w:color="FFFFFF" w:sz="0"/>
+              <w:bottom w:val="single" w:color="D5D9E0" w:sz="4"/>
+              <w:right w:val="none" w:color="FFFFFF" w:sz="0"/>
+            </w:tcBorders>
+            <w:shd w:fill="14284B" w:color="auto" w:val="clear"/>
+            <w:tcMar>
+              <w:top w:type="dxa" w:w="40"/>
+              <w:left w:type="dxa" w:w="70"/>
+              <w:bottom w:type="dxa" w:w="40"/>
+              <w:right w:type="dxa" w:w="70"/>
+            </w:tcMar>
+            <w:vAlign w:val="top"/>
+          </w:tcPr>
+          <w:p>
+            <w:pPr>
+              <w:spacing w:after="0" w:before="0" w:line="216" w:lineRule="auto"/>
+              <w:jc w:val="left"/>
+            </w:pPr>
+            <w:r>
+              <w:rPr>
+                <w:rFonts w:ascii="Arial" w:cs="Arial" w:eastAsia="Arial" w:hAnsi="Arial"/>
+                <w:b/>
+                <w:bCs/>
+                <w:color w:val="FFFFFF"/>
+                <w:sz w:val="14"/>
+                <w:szCs w:val="14"/>
+              </w:rPr>
+              <w:t xml:space="preserve">Government</w:t>
+            </w:r>
+          </w:p>
+        </w:tc>
+        <w:tc>
+          <w:tcPr>
+            <w:tcW w:type="dxa" w:w="4250"/>
+            <w:tcBorders>
+              <w:top w:val="single" w:color="D5D9E0" w:sz="4"/>
+              <w:left w:val="none" w:color="FFFFFF" w:sz="0"/>
+              <w:bottom w:val="single" w:color="D5D9E0" w:sz="4"/>
+              <w:right w:val="none" w:color="FFFFFF" w:sz="0"/>
+            </w:tcBorders>
+            <w:shd w:fill="14284B" w:color="auto" w:val="clear"/>
+            <w:tcMar>
+              <w:top w:type="dxa" w:w="40"/>
+              <w:left w:type="dxa" w:w="70"/>
+              <w:bottom w:type="dxa" w:w="40"/>
+              <w:right w:type="dxa" w:w="70"/>
+            </w:tcMar>
+            <w:vAlign w:val="top"/>
+          </w:tcPr>
+          <w:p>
+            <w:pPr>
+              <w:spacing w:after="0" w:before="0" w:line="216" w:lineRule="auto"/>
+              <w:jc w:val="left"/>
+            </w:pPr>
+            <w:r>
+              <w:rPr>
+                <w:rFonts w:ascii="Arial" w:cs="Arial" w:eastAsia="Arial" w:hAnsi="Arial"/>
+                <w:b/>
+                <w:bCs/>
+                <w:color w:val="FFFFFF"/>
+                <w:sz w:val="14"/>
+                <w:szCs w:val="14"/>
+              </w:rPr>
+              <w:t xml:space="preserve">Measures and signals</w:t>
+            </w:r>
+          </w:p>
+        </w:tc>
+        <w:tc>
+          <w:tcPr>
+            <w:tcW w:type="dxa" w:w="3416"/>
+            <w:tcBorders>
+              <w:top w:val="single" w:color="D5D9E0" w:sz="4"/>
+              <w:left w:val="none" w:color="FFFFFF" w:sz="0"/>
+              <w:bottom w:val="single" w:color="D5D9E0" w:sz="4"/>
+              <w:right w:val="none" w:color="FFFFFF" w:sz="0"/>
+            </w:tcBorders>
+            <w:shd w:fill="14284B" w:color="auto" w:val="clear"/>
+            <w:tcMar>
+              <w:top w:type="dxa" w:w="40"/>
+              <w:left w:type="dxa" w:w="70"/>
+              <w:bottom w:type="dxa" w:w="40"/>
+              <w:right w:type="dxa" w:w="70"/>
+            </w:tcMar>
+            <w:vAlign w:val="top"/>
+          </w:tcPr>
+          <w:p>
+            <w:pPr>
+              <w:spacing w:after="0" w:before="0" w:line="216" w:lineRule="auto"/>
+              <w:jc w:val="left"/>
+            </w:pPr>
+            <w:r>
+              <w:rPr>
+                <w:rFonts w:ascii="Arial" w:cs="Arial" w:eastAsia="Arial" w:hAnsi="Arial"/>
+                <w:b/>
+                <w:bCs/>
+                <w:color w:val="FFFFFF"/>
+                <w:sz w:val="14"/>
+                <w:szCs w:val="14"/>
+              </w:rPr>
+              <w:t xml:space="preserve">Implication for Mallplaza</w:t>
+            </w:r>
+          </w:p>
+        </w:tc>
+      </w:tr>
+      <w:tr>
+        <w:trPr>
+          <w:cantSplit/>
+        </w:trPr>
+        <w:tc>
+          <w:tcPr>
+            <w:tcW w:type="dxa" w:w="1300"/>
+            <w:tcBorders>
+              <w:top w:val="single" w:color="D5D9E0" w:sz="4"/>
+              <w:left w:val="none" w:color="FFFFFF" w:sz="0"/>
+              <w:bottom w:val="single" w:color="D5D9E0" w:sz="4"/>
+              <w:right w:val="none" w:color="FFFFFF" w:sz="0"/>
+            </w:tcBorders>
+            <w:tcMar>
+              <w:top w:type="dxa" w:w="40"/>
+              <w:left w:type="dxa" w:w="70"/>
+              <w:bottom w:type="dxa" w:w="40"/>
+              <w:right w:type="dxa" w:w="70"/>
+            </w:tcMar>
+            <w:vAlign w:val="top"/>
+          </w:tcPr>
+          <w:p>
+            <w:pPr>
+              <w:spacing w:after="0" w:before="0" w:line="216" w:lineRule="auto"/>
+              <w:jc w:val="left"/>
+            </w:pPr>
+            <w:r>
+              <w:rPr>
+                <w:rFonts w:ascii="Arial" w:cs="Arial" w:eastAsia="Arial" w:hAnsi="Arial"/>
+                <w:b/>
+                <w:bCs/>
+                <w:color w:val="1A1A1A"/>
+                <w:sz w:val="14"/>
+                <w:szCs w:val="14"/>
+              </w:rPr>
+              <w:t xml:space="preserve">Chile</w:t>
+            </w:r>
+          </w:p>
+          <w:p>
+            <w:pPr>
+              <w:spacing w:after="0" w:before="0" w:line="216" w:lineRule="auto"/>
+              <w:jc w:val="left"/>
+            </w:pPr>
+            <w:r>
+              <w:rPr>
+                <w:rFonts w:ascii="Arial" w:cs="Arial" w:eastAsia="Arial" w:hAnsi="Arial"/>
+                <w:b w:val="false"/>
+                <w:bCs w:val="false"/>
+                <w:color w:val="5F5F5F"/>
+                <w:sz w:val="13"/>
+                <w:szCs w:val="13"/>
+              </w:rPr>
+              <w:t xml:space="preserve">~71% of revenue</w:t>
+            </w:r>
+          </w:p>
+        </w:tc>
+        <w:tc>
+          <w:tcPr>
+            <w:tcW w:type="dxa" w:w="1700"/>
+            <w:tcBorders>
+              <w:top w:val="single" w:color="D5D9E0" w:sz="4"/>
+              <w:left w:val="none" w:color="FFFFFF" w:sz="0"/>
+              <w:bottom w:val="single" w:color="D5D9E0" w:sz="4"/>
+              <w:right w:val="none" w:color="FFFFFF" w:sz="0"/>
+            </w:tcBorders>
+            <w:tcMar>
+              <w:top w:type="dxa" w:w="40"/>
+              <w:left w:type="dxa" w:w="70"/>
+              <w:bottom w:type="dxa" w:w="40"/>
+              <w:right w:type="dxa" w:w="70"/>
+            </w:tcMar>
+            <w:vAlign w:val="top"/>
+          </w:tcPr>
+          <w:p>
+            <w:pPr>
+              <w:spacing w:after="0" w:before="0" w:line="216" w:lineRule="auto"/>
+              <w:jc w:val="left"/>
+            </w:pPr>
+            <w:r>
+              <w:rPr>
+                <w:rFonts w:ascii="Arial" w:cs="Arial" w:eastAsia="Arial" w:hAnsi="Arial"/>
+                <w:b/>
+                <w:bCs/>
+                <w:color w:val="1A1A1A"/>
+                <w:sz w:val="14"/>
+                <w:szCs w:val="14"/>
+              </w:rPr>
+              <w:t xml:space="preserve">José Antonio Kast</w:t>
+            </w:r>
+          </w:p>
+          <w:p>
+            <w:pPr>
+              <w:spacing w:after="0" w:before="0" w:line="216" w:lineRule="auto"/>
+              <w:jc w:val="left"/>
+            </w:pPr>
+            <w:r>
+              <w:rPr>
+                <w:rFonts w:ascii="Arial" w:cs="Arial" w:eastAsia="Arial" w:hAnsi="Arial"/>
+                <w:b w:val="false"/>
+                <w:bCs w:val="false"/>
+                <w:color w:val="5F5F5F"/>
+                <w:sz w:val="13"/>
+                <w:szCs w:val="13"/>
+              </w:rPr>
+              <w:t xml:space="preserve">(since Mar-26)</w:t>
+            </w:r>
+          </w:p>
+        </w:tc>
+        <w:tc>
+          <w:tcPr>
+            <w:tcW w:type="dxa" w:w="4250"/>
+            <w:tcBorders>
+              <w:top w:val="single" w:color="D5D9E0" w:sz="4"/>
+              <w:left w:val="none" w:color="FFFFFF" w:sz="0"/>
+              <w:bottom w:val="single" w:color="D5D9E0" w:sz="4"/>
+              <w:right w:val="none" w:color="FFFFFF" w:sz="0"/>
+            </w:tcBorders>
+            <w:tcMar>
+              <w:top w:type="dxa" w:w="40"/>
+              <w:left w:type="dxa" w:w="70"/>
+              <w:bottom w:type="dxa" w:w="40"/>
+              <w:right w:type="dxa" w:w="70"/>
+            </w:tcMar>
+            <w:vAlign w:val="top"/>
+          </w:tcPr>
+          <w:p>
+            <w:pPr>
+              <w:spacing w:after="0" w:before="0" w:line="216" w:lineRule="auto"/>
+              <w:jc w:val="both"/>
+            </w:pPr>
+            <w:r>
+              <w:rPr>
+                <w:rFonts w:ascii="Arial" w:cs="Arial" w:eastAsia="Arial" w:hAnsi="Arial"/>
+                <w:b w:val="false"/>
+                <w:bCs w:val="false"/>
+                <w:color w:val="1A1A1A"/>
+                <w:sz w:val="14"/>
+                <w:szCs w:val="14"/>
+              </w:rPr>
+              <w:t xml:space="preserve">Signed the Reconstruction Law (9-Oct-26): corporate tax from 27% to 23% gradually from 2027 and tax invariability [1]. 2027 budget with spending +2.7% vs the 2026 law [2]. S&amp;P affirmed A stable (Sep-26) [3]. Policy rate 4.5% [4]. Stable Senate, fragile lower house [5].</w:t>
+            </w:r>
+          </w:p>
+        </w:tc>
+        <w:tc>
+          <w:tcPr>
+            <w:tcW w:type="dxa" w:w="3416"/>
+            <w:tcBorders>
+              <w:top w:val="single" w:color="D5D9E0" w:sz="4"/>
+              <w:left w:val="none" w:color="FFFFFF" w:sz="0"/>
+              <w:bottom w:val="single" w:color="D5D9E0" w:sz="4"/>
+              <w:right w:val="none" w:color="FFFFFF" w:sz="0"/>
+            </w:tcBorders>
+            <w:tcMar>
+              <w:top w:type="dxa" w:w="40"/>
+              <w:left w:type="dxa" w:w="70"/>
+              <w:bottom w:type="dxa" w:w="40"/>
+              <w:right w:type="dxa" w:w="70"/>
+            </w:tcMar>
+            <w:vAlign w:val="top"/>
+          </w:tcPr>
+          <w:p>
+            <w:pPr>
+              <w:spacing w:after="0" w:before="0" w:line="216" w:lineRule="auto"/>
+              <w:jc w:val="both"/>
+            </w:pPr>
+            <w:r>
+              <w:rPr>
+                <w:rFonts w:ascii="Arial" w:cs="Arial" w:eastAsia="Arial" w:hAnsi="Arial"/>
+                <w:b w:val="false"/>
+                <w:bCs w:val="false"/>
+                <w:color w:val="1A1A1A"/>
+                <w:sz w:val="14"/>
+                <w:szCs w:val="14"/>
+              </w:rPr>
+              <w:t xml:space="preserve">Positive: lower tax (+3.9% on the target price if applied, not included) and faster permits (Law 21,770). Risk: passing the rest of the agenda depends on a lower house without a comfortable majority.</w:t>
+            </w:r>
+          </w:p>
+        </w:tc>
+      </w:tr>
+      <w:tr>
+        <w:trPr>
+          <w:cantSplit/>
+        </w:trPr>
+        <w:tc>
+          <w:tcPr>
+            <w:tcW w:type="dxa" w:w="1300"/>
+            <w:tcBorders>
+              <w:top w:val="single" w:color="D5D9E0" w:sz="4"/>
+              <w:left w:val="none" w:color="FFFFFF" w:sz="0"/>
+              <w:bottom w:val="single" w:color="D5D9E0" w:sz="4"/>
+              <w:right w:val="none" w:color="FFFFFF" w:sz="0"/>
+            </w:tcBorders>
+            <w:shd w:fill="EEF1F6" w:color="auto" w:val="clear"/>
+            <w:tcMar>
+              <w:top w:type="dxa" w:w="40"/>
+              <w:left w:type="dxa" w:w="70"/>
+              <w:bottom w:type="dxa" w:w="40"/>
+              <w:right w:type="dxa" w:w="70"/>
+            </w:tcMar>
+            <w:vAlign w:val="top"/>
+          </w:tcPr>
+          <w:p>
+            <w:pPr>
+              <w:spacing w:after="0" w:before="0" w:line="216" w:lineRule="auto"/>
+              <w:jc w:val="left"/>
+            </w:pPr>
+            <w:r>
+              <w:rPr>
+                <w:rFonts w:ascii="Arial" w:cs="Arial" w:eastAsia="Arial" w:hAnsi="Arial"/>
+                <w:b/>
+                <w:bCs/>
+                <w:color w:val="1A1A1A"/>
+                <w:sz w:val="14"/>
+                <w:szCs w:val="14"/>
+              </w:rPr>
+              <w:t xml:space="preserve">Peru</w:t>
+            </w:r>
+          </w:p>
+          <w:p>
+            <w:pPr>
+              <w:spacing w:after="0" w:before="0" w:line="216" w:lineRule="auto"/>
+              <w:jc w:val="left"/>
+            </w:pPr>
+            <w:r>
+              <w:rPr>
+                <w:rFonts w:ascii="Arial" w:cs="Arial" w:eastAsia="Arial" w:hAnsi="Arial"/>
+                <w:b w:val="false"/>
+                <w:bCs w:val="false"/>
+                <w:color w:val="5F5F5F"/>
+                <w:sz w:val="13"/>
+                <w:szCs w:val="13"/>
+              </w:rPr>
+              <w:t xml:space="preserve">~19% of revenue</w:t>
+            </w:r>
+          </w:p>
+        </w:tc>
+        <w:tc>
+          <w:tcPr>
+            <w:tcW w:type="dxa" w:w="1700"/>
+            <w:tcBorders>
+              <w:top w:val="single" w:color="D5D9E0" w:sz="4"/>
+              <w:left w:val="none" w:color="FFFFFF" w:sz="0"/>
+              <w:bottom w:val="single" w:color="D5D9E0" w:sz="4"/>
+              <w:right w:val="none" w:color="FFFFFF" w:sz="0"/>
+            </w:tcBorders>
+            <w:shd w:fill="EEF1F6" w:color="auto" w:val="clear"/>
+            <w:tcMar>
+              <w:top w:type="dxa" w:w="40"/>
+              <w:left w:type="dxa" w:w="70"/>
+              <w:bottom w:type="dxa" w:w="40"/>
+              <w:right w:type="dxa" w:w="70"/>
+            </w:tcMar>
+            <w:vAlign w:val="top"/>
+          </w:tcPr>
+          <w:p>
+            <w:pPr>
+              <w:spacing w:after="0" w:before="0" w:line="216" w:lineRule="auto"/>
+              <w:jc w:val="left"/>
+            </w:pPr>
+            <w:r>
+              <w:rPr>
+                <w:rFonts w:ascii="Arial" w:cs="Arial" w:eastAsia="Arial" w:hAnsi="Arial"/>
+                <w:b/>
+                <w:bCs/>
+                <w:color w:val="1A1A1A"/>
+                <w:sz w:val="14"/>
+                <w:szCs w:val="14"/>
+              </w:rPr>
+              <w:t xml:space="preserve">Keiko Fujimori</w:t>
+            </w:r>
+          </w:p>
+          <w:p>
+            <w:pPr>
+              <w:spacing w:after="0" w:before="0" w:line="216" w:lineRule="auto"/>
+              <w:jc w:val="left"/>
+            </w:pPr>
+            <w:r>
+              <w:rPr>
+                <w:rFonts w:ascii="Arial" w:cs="Arial" w:eastAsia="Arial" w:hAnsi="Arial"/>
+                <w:b w:val="false"/>
+                <w:bCs w:val="false"/>
+                <w:color w:val="5F5F5F"/>
+                <w:sz w:val="13"/>
+                <w:szCs w:val="13"/>
+              </w:rPr>
+              <w:t xml:space="preserve">(since 28-Jul-26)</w:t>
+            </w:r>
+          </w:p>
+        </w:tc>
+        <w:tc>
+          <w:tcPr>
+            <w:tcW w:type="dxa" w:w="4250"/>
+            <w:tcBorders>
+              <w:top w:val="single" w:color="D5D9E0" w:sz="4"/>
+              <w:left w:val="none" w:color="FFFFFF" w:sz="0"/>
+              <w:bottom w:val="single" w:color="D5D9E0" w:sz="4"/>
+              <w:right w:val="none" w:color="FFFFFF" w:sz="0"/>
+            </w:tcBorders>
+            <w:shd w:fill="EEF1F6" w:color="auto" w:val="clear"/>
+            <w:tcMar>
+              <w:top w:type="dxa" w:w="40"/>
+              <w:left w:type="dxa" w:w="70"/>
+              <w:bottom w:type="dxa" w:w="40"/>
+              <w:right w:type="dxa" w:w="70"/>
+            </w:tcMar>
+            <w:vAlign w:val="top"/>
+          </w:tcPr>
+          <w:p>
+            <w:pPr>
+              <w:spacing w:after="0" w:before="0" w:line="216" w:lineRule="auto"/>
+              <w:jc w:val="both"/>
+            </w:pPr>
+            <w:r>
+              <w:rPr>
+                <w:rFonts w:ascii="Arial" w:cs="Arial" w:eastAsia="Arial" w:hAnsi="Arial"/>
+                <w:b w:val="false"/>
+                <w:bCs w:val="false"/>
+                <w:color w:val="1A1A1A"/>
+                <w:sz w:val="14"/>
+                <w:szCs w:val="14"/>
+              </w:rPr>
+              <w:t xml:space="preserve">Minimum wage from S/ 1,130 to 1,300 and Pensión 65 doubled (S/ 350 to 700) [6]. 2027 budget of S/ 266,506 million, consistent with a 1.4% of GDP deficit [7]. BCRP holds at 4.25% [8]. Fuerza Popular lacks a majority in the bicameral Congress [9].</w:t>
+            </w:r>
+          </w:p>
+        </w:tc>
+        <w:tc>
+          <w:tcPr>
+            <w:tcW w:type="dxa" w:w="3416"/>
+            <w:tcBorders>
+              <w:top w:val="single" w:color="D5D9E0" w:sz="4"/>
+              <w:left w:val="none" w:color="FFFFFF" w:sz="0"/>
+              <w:bottom w:val="single" w:color="D5D9E0" w:sz="4"/>
+              <w:right w:val="none" w:color="FFFFFF" w:sz="0"/>
+            </w:tcBorders>
+            <w:shd w:fill="EEF1F6" w:color="auto" w:val="clear"/>
+            <w:tcMar>
+              <w:top w:type="dxa" w:w="40"/>
+              <w:left w:type="dxa" w:w="70"/>
+              <w:bottom w:type="dxa" w:w="40"/>
+              <w:right w:type="dxa" w:w="70"/>
+            </w:tcMar>
+            <w:vAlign w:val="top"/>
+          </w:tcPr>
+          <w:p>
+            <w:pPr>
+              <w:spacing w:after="0" w:before="0" w:line="216" w:lineRule="auto"/>
+              <w:jc w:val="both"/>
+            </w:pPr>
+            <w:r>
+              <w:rPr>
+                <w:rFonts w:ascii="Arial" w:cs="Arial" w:eastAsia="Arial" w:hAnsi="Arial"/>
+                <w:b w:val="false"/>
+                <w:bCs w:val="false"/>
+                <w:color w:val="1A1A1A"/>
+                <w:sz w:val="14"/>
+                <w:szCs w:val="14"/>
+              </w:rPr>
+              <w:t xml:space="preserve">Positive for consumption and tenant sales. Risk: governability and the fiscal cost of laws passed by the previous Congress (up to S/ 50,000 million per the MEF) [7].</w:t>
+            </w:r>
+          </w:p>
+        </w:tc>
+      </w:tr>
+      <w:tr>
+        <w:trPr>
+          <w:cantSplit/>
+        </w:trPr>
+        <w:tc>
+          <w:tcPr>
+            <w:tcW w:type="dxa" w:w="1300"/>
+            <w:tcBorders>
+              <w:top w:val="single" w:color="D5D9E0" w:sz="4"/>
+              <w:left w:val="none" w:color="FFFFFF" w:sz="0"/>
+              <w:bottom w:val="single" w:color="D5D9E0" w:sz="4"/>
+              <w:right w:val="none" w:color="FFFFFF" w:sz="0"/>
+            </w:tcBorders>
+            <w:tcMar>
+              <w:top w:type="dxa" w:w="40"/>
+              <w:left w:type="dxa" w:w="70"/>
+              <w:bottom w:type="dxa" w:w="40"/>
+              <w:right w:type="dxa" w:w="70"/>
+            </w:tcMar>
+            <w:vAlign w:val="top"/>
+          </w:tcPr>
+          <w:p>
+            <w:pPr>
+              <w:spacing w:after="0" w:before="0" w:line="216" w:lineRule="auto"/>
+              <w:jc w:val="left"/>
+            </w:pPr>
+            <w:r>
+              <w:rPr>
+                <w:rFonts w:ascii="Arial" w:cs="Arial" w:eastAsia="Arial" w:hAnsi="Arial"/>
+                <w:b/>
+                <w:bCs/>
+                <w:color w:val="1A1A1A"/>
+                <w:sz w:val="14"/>
+                <w:szCs w:val="14"/>
+              </w:rPr>
+              <w:t xml:space="preserve">Colombia</w:t>
+            </w:r>
+          </w:p>
+          <w:p>
+            <w:pPr>
+              <w:spacing w:after="0" w:before="0" w:line="216" w:lineRule="auto"/>
+              <w:jc w:val="left"/>
+            </w:pPr>
+            <w:r>
+              <w:rPr>
+                <w:rFonts w:ascii="Arial" w:cs="Arial" w:eastAsia="Arial" w:hAnsi="Arial"/>
+                <w:b w:val="false"/>
+                <w:bCs w:val="false"/>
+                <w:color w:val="5F5F5F"/>
+                <w:sz w:val="13"/>
+                <w:szCs w:val="13"/>
+              </w:rPr>
+              <w:t xml:space="preserve">~11% of revenue</w:t>
+            </w:r>
+          </w:p>
+        </w:tc>
+        <w:tc>
+          <w:tcPr>
+            <w:tcW w:type="dxa" w:w="1700"/>
+            <w:tcBorders>
+              <w:top w:val="single" w:color="D5D9E0" w:sz="4"/>
+              <w:left w:val="none" w:color="FFFFFF" w:sz="0"/>
+              <w:bottom w:val="single" w:color="D5D9E0" w:sz="4"/>
+              <w:right w:val="none" w:color="FFFFFF" w:sz="0"/>
+            </w:tcBorders>
+            <w:tcMar>
+              <w:top w:type="dxa" w:w="40"/>
+              <w:left w:type="dxa" w:w="70"/>
+              <w:bottom w:type="dxa" w:w="40"/>
+              <w:right w:type="dxa" w:w="70"/>
+            </w:tcMar>
+            <w:vAlign w:val="top"/>
+          </w:tcPr>
+          <w:p>
+            <w:pPr>
+              <w:spacing w:after="0" w:before="0" w:line="216" w:lineRule="auto"/>
+              <w:jc w:val="left"/>
+            </w:pPr>
+            <w:r>
+              <w:rPr>
+                <w:rFonts w:ascii="Arial" w:cs="Arial" w:eastAsia="Arial" w:hAnsi="Arial"/>
+                <w:b/>
+                <w:bCs/>
+                <w:color w:val="1A1A1A"/>
+                <w:sz w:val="14"/>
+                <w:szCs w:val="14"/>
+              </w:rPr>
+              <w:t xml:space="preserve">Abelardo de la Espriella</w:t>
+            </w:r>
+          </w:p>
+          <w:p>
+            <w:pPr>
+              <w:spacing w:after="0" w:before="0" w:line="216" w:lineRule="auto"/>
+              <w:jc w:val="left"/>
+            </w:pPr>
+            <w:r>
+              <w:rPr>
+                <w:rFonts w:ascii="Arial" w:cs="Arial" w:eastAsia="Arial" w:hAnsi="Arial"/>
+                <w:b w:val="false"/>
+                <w:bCs w:val="false"/>
+                <w:color w:val="5F5F5F"/>
+                <w:sz w:val="13"/>
+                <w:szCs w:val="13"/>
+              </w:rPr>
+              <w:t xml:space="preserve">(since 7-Aug-26)</w:t>
+            </w:r>
+          </w:p>
+        </w:tc>
+        <w:tc>
+          <w:tcPr>
+            <w:tcW w:type="dxa" w:w="4250"/>
+            <w:tcBorders>
+              <w:top w:val="single" w:color="D5D9E0" w:sz="4"/>
+              <w:left w:val="none" w:color="FFFFFF" w:sz="0"/>
+              <w:bottom w:val="single" w:color="D5D9E0" w:sz="4"/>
+              <w:right w:val="none" w:color="FFFFFF" w:sz="0"/>
+            </w:tcBorders>
+            <w:tcMar>
+              <w:top w:type="dxa" w:w="40"/>
+              <w:left w:type="dxa" w:w="70"/>
+              <w:bottom w:type="dxa" w:w="40"/>
+              <w:right w:type="dxa" w:w="70"/>
+            </w:tcMar>
+            <w:vAlign w:val="top"/>
+          </w:tcPr>
+          <w:p>
+            <w:pPr>
+              <w:spacing w:after="0" w:before="0" w:line="216" w:lineRule="auto"/>
+              <w:jc w:val="both"/>
+            </w:pPr>
+            <w:r>
+              <w:rPr>
+                <w:rFonts w:ascii="Arial" w:cs="Arial" w:eastAsia="Arial" w:hAnsi="Arial"/>
+                <w:b w:val="false"/>
+                <w:bCs w:val="false"/>
+                <w:color w:val="1A1A1A"/>
+                <w:sz w:val="14"/>
+                <w:szCs w:val="14"/>
+              </w:rPr>
+              <w:t xml:space="preserve">The finance ministry puts the deficit at 7.8% of GDP and proposes spending cuts of at least 1% of GDP [10]; tax reform to lower the corporate burden [11]. The central bank raised its rate to 12.25% (30-Sep-26) [12]. S&amp;P BB- stable [13].</w:t>
+            </w:r>
+          </w:p>
+        </w:tc>
+        <w:tc>
+          <w:tcPr>
+            <w:tcW w:type="dxa" w:w="3416"/>
+            <w:tcBorders>
+              <w:top w:val="single" w:color="D5D9E0" w:sz="4"/>
+              <w:left w:val="none" w:color="FFFFFF" w:sz="0"/>
+              <w:bottom w:val="single" w:color="D5D9E0" w:sz="4"/>
+              <w:right w:val="none" w:color="FFFFFF" w:sz="0"/>
+            </w:tcBorders>
+            <w:tcMar>
+              <w:top w:type="dxa" w:w="40"/>
+              <w:left w:type="dxa" w:w="70"/>
+              <w:bottom w:type="dxa" w:w="40"/>
+              <w:right w:type="dxa" w:w="70"/>
+            </w:tcMar>
+            <w:vAlign w:val="top"/>
+          </w:tcPr>
+          <w:p>
+            <w:pPr>
+              <w:spacing w:after="0" w:before="0" w:line="216" w:lineRule="auto"/>
+              <w:jc w:val="both"/>
+            </w:pPr>
+            <w:r>
+              <w:rPr>
+                <w:rFonts w:ascii="Arial" w:cs="Arial" w:eastAsia="Arial" w:hAnsi="Arial"/>
+                <w:b w:val="false"/>
+                <w:bCs w:val="false"/>
+                <w:color w:val="1A1A1A"/>
+                <w:sz w:val="14"/>
+                <w:szCs w:val="14"/>
+              </w:rPr>
+              <w:t xml:space="preserve">Short-term negative: fiscal tightening and high rates slow consumption and pressure the COP (MR3). Limited weight in value.</w:t>
+            </w:r>
+          </w:p>
+        </w:tc>
+      </w:tr>
+    </w:tbl>
+    <w:p>
+      <w:pPr>
+        <w:spacing w:after="0" w:before="50" w:line="216" w:lineRule="auto"/>
+        <w:jc w:val="both"/>
+      </w:pPr>
+      <w:r>
+        <w:rPr>
+          <w:rFonts w:ascii="Arial" w:cs="Arial" w:eastAsia="Arial" w:hAnsi="Arial"/>
+          <w:color w:val="5F5F5F"/>
+          <w:sz w:val="11"/>
+          <w:szCs w:val="11"/>
+        </w:rPr>
+        <w:t xml:space="preserve">[1] Emol, 9-Oct-26, “Ley de Reconstrucción promulgada”; CNN Chile, Oct-26. [2] Diario Financiero / El Mostrador, 3-Oct-26. [3] Chilean Ministry of Finance, note on Fitch and S&amp;P, Sep-26. [4] Central Bank of Chile, Oct-26 meeting. [5] El Dínamo, 11-Mar-26. [6] Infobae / La República (Peru), 28-Jul-26. [7] Infobae, 29-Aug-26; El Comercio (MEF). [8] Infobae, 11-Sep-26. [9] América TV, 2026. [10] El Tiempo / La Silla Vacía, Jul-26. [11] Valora Analitik / El Colombiano, 2026. [12] Banco de la República, statement 30-Sep-26. [13] IRC – Colombian Ministry of Finance. Revenue shares 2026E: team model. Source: Team analysis.</w:t>
+      </w:r>
+    </w:p>
     <w:sectPr>
       <w:headerReference w:type="default" r:id="rId7"/>
       <w:footerReference w:type="default" r:id="rId8"/>

</xml_diff>

<commit_message>
Fit Investment Risks on one page: political context into RR2, shorter assessment, drop sensitivity section
Co-Authored-By: Claude Opus 5.5 <noreply@anthropic.com>
Claude-Session: https://claude.ai/code/session_0188QZHBkA8n5QL7BtmFakQg
</commit_message>
<xml_diff>
--- a/informe/Mallplaza_Investment_Risks_EN.docx
+++ b/informe/Mallplaza_Investment_Risks_EN.docx
@@ -103,7 +103,7 @@
                 <w:sz w:val="16"/>
                 <w:szCs w:val="16"/>
               </w:rPr>
-              <w:t xml:space="preserve">Figure 23 places each risk in a 3x3 matrix by likelihood and impact (low, medium, high); the colour of each label shows its category. Impact is measured as the effect on value per share, using the operational tornado (Figure 24), the WACC and g sensitivity (Figure 25) and the UF sensitivity (Figure 26). Risks that could not be quantified with the model (RR1 and RR2) are placed according to the team's qualitative analysis. Interest-rate risk (FR1) sits in the most severe cell (high/high), and inflation and the macro cycle (MR1) also fall in the red zone; operating deterioration (OR1) and FX (MR3) sit in the centre.</w:t>
+              <w:t xml:space="preserve">Figure 23 classifies each risk by likelihood and by its impact on value per share (Figures 24 to 26). Risks that could not be quantified are classified according to the team's qualitative analysis of the company.</w:t>
             </w:r>
           </w:p>
           <w:p>
@@ -734,7 +734,7 @@
                 <w:sz w:val="16"/>
                 <w:szCs w:val="16"/>
               </w:rPr>
-              <w:t xml:space="preserve">All three governments took office in 2026 with pro-investment agendas, but with different fiscal and legislative room (see Political and economic context): in Chile the corporate tax cut is already law, in Peru the government lacks its own majority, and in Colombia fiscal tightening and high rates weigh on consumption. Permit delays push back pipeline revenue (USD 613 million, 170,200 m² to 2028), with limited value sensitivity. </w:t>
+              <w:t xml:space="preserve">Changes in tax, permitting and economic policy in all three countries. In Chile, the ruling coalition lacks a comfortable majority in the lower house for the rest of its agenda (El Dínamo, 11-Mar-26). In Peru, Fuerza Popular lacks a majority in the new bicameral Congress and the MEF puts the cost of laws passed by the previous Congress at up to S/ 50,000 million (El Comercio). In Colombia, the finance ministry puts the deficit at 7.8% of GDP and proposes spending cuts of at least 1% of GDP (El Tiempo, Jul-26), and the central bank raised its rate to 12.25% (30-Sep-26), which slows consumption. Permit delays push back the pipeline (USD 613 million, 170,200 m² to 2028). </w:t>
             </w:r>
             <w:r>
               <w:rPr>
@@ -771,7 +771,7 @@
                 <w:sz w:val="16"/>
                 <w:szCs w:val="16"/>
               </w:rPr>
-              <w:t xml:space="preserve">Law 21,770 (Sep-25) shortens permitting times and Colombia contributes only ~11% of revenue. The model keeps 27%: applying the cut to the Chilean share would lift DCF value ~5.4% (+3.9% on the target price), still far from the market price.</w:t>
+              <w:t xml:space="preserve">pro-investment agendas. In Chile, Kast signed the Reconstruction Law (9-Oct-26), which gradually cuts corporate tax from 27% to 23% from 2027 (Emol, 9-Oct-26), S&amp;P affirmed its A stable rating and Law 21,770 (Sep-25) shortens permitting. In Peru, the minimum-wage rise to S/ 1,300 and the doubling of Pensión 65 support consumption (Infobae, 28-Jul-26). Colombia contributes only ~11% of revenue. The model keeps 27%: the Chilean cut would add ~3.9% to the target price.</w:t>
             </w:r>
           </w:p>
         </w:tc>
@@ -843,7 +843,7 @@
             <w:r>
               <w:drawing>
                 <wp:inline distT="0" distB="0" distL="0" distR="0">
-                  <wp:extent cx="2257425" cy="1962150"/>
+                  <wp:extent cx="2257425" cy="1876425"/>
                   <wp:effectExtent t="0" r="0" b="0" l="0"/>
                   <wp:docPr id="1" name="" descr="" title=""/>
                   <wp:cNvGraphicFramePr>
@@ -868,7 +868,7 @@
                         <pic:spPr bwMode="auto">
                           <a:xfrm>
                             <a:off x="0" y="0"/>
-                            <a:ext cx="2257425" cy="1962150"/>
+                            <a:ext cx="2257425" cy="1876425"/>
                           </a:xfrm>
                           <a:prstGeom prst="rect">
                             <a:avLst/>
@@ -927,7 +927,7 @@
             <w:r>
               <w:drawing>
                 <wp:inline distT="0" distB="0" distL="0" distR="0">
-                  <wp:extent cx="2257425" cy="2152650"/>
+                  <wp:extent cx="2257425" cy="1962150"/>
                   <wp:effectExtent t="0" r="0" b="0" l="0"/>
                   <wp:docPr id="1" name="" descr="" title=""/>
                   <wp:cNvGraphicFramePr>
@@ -952,7 +952,7 @@
                         <pic:spPr bwMode="auto">
                           <a:xfrm>
                             <a:off x="0" y="0"/>
-                            <a:ext cx="2257425" cy="2152650"/>
+                            <a:ext cx="2257425" cy="1962150"/>
                           </a:xfrm>
                           <a:prstGeom prst="rect">
                             <a:avLst/>
@@ -1011,7 +1011,7 @@
             <w:r>
               <w:drawing>
                 <wp:inline distT="0" distB="0" distL="0" distR="0">
-                  <wp:extent cx="2257425" cy="1600200"/>
+                  <wp:extent cx="2257425" cy="1552575"/>
                   <wp:effectExtent t="0" r="0" b="0" l="0"/>
                   <wp:docPr id="1" name="" descr="" title=""/>
                   <wp:cNvGraphicFramePr>
@@ -1036,7 +1036,7 @@
                         <pic:spPr bwMode="auto">
                           <a:xfrm>
                             <a:off x="0" y="0"/>
-                            <a:ext cx="2257425" cy="1600200"/>
+                            <a:ext cx="2257425" cy="1552575"/>
                           </a:xfrm>
                           <a:prstGeom prst="rect">
                             <a:avLst/>
@@ -1063,124 +1063,9 @@
               <w:t xml:space="preserve">Target price = 80% DCF + 20% EV/EBITDA multiples (CLP 2,951). The g = 2.0% column uses the same formula as the Sensibilidad sheet. Source: Team analysis.</w:t>
             </w:r>
           </w:p>
-        </w:tc>
-      </w:tr>
-    </w:tbl>
-    <w:p>
-      <w:pPr>
-        <w:pageBreakBefore/>
-        <w:spacing w:after="0" w:before="0"/>
-      </w:pPr>
-    </w:p>
-    <w:tbl>
-      <w:tblPr>
-        <w:tblW w:type="dxa" w:w="10666"/>
-        <w:tblBorders>
-          <w:top w:val="none" w:color="FFFFFF" w:sz="0"/>
-          <w:left w:val="none" w:color="FFFFFF" w:sz="0"/>
-          <w:bottom w:val="none" w:color="FFFFFF" w:sz="0"/>
-          <w:right w:val="none" w:color="FFFFFF" w:sz="0"/>
-          <w:insideH w:val="none" w:color="FFFFFF" w:sz="0"/>
-          <w:insideV w:val="none" w:color="FFFFFF" w:sz="0"/>
-        </w:tblBorders>
-      </w:tblPr>
-      <w:tblGrid>
-        <w:gridCol w:w="6900"/>
-        <w:gridCol w:w="216"/>
-        <w:gridCol w:w="3550"/>
-      </w:tblGrid>
-      <w:tr>
-        <w:tc>
-          <w:tcPr>
-            <w:tcW w:type="dxa" w:w="6900"/>
-            <w:tcBorders>
-              <w:top w:val="none" w:color="FFFFFF" w:sz="0"/>
-              <w:left w:val="none" w:color="FFFFFF" w:sz="0"/>
-              <w:bottom w:val="none" w:color="FFFFFF" w:sz="0"/>
-              <w:right w:val="none" w:color="FFFFFF" w:sz="0"/>
-            </w:tcBorders>
-            <w:tcMar>
-              <w:top w:type="dxa" w:w="0"/>
-              <w:left w:type="dxa" w:w="0"/>
-              <w:bottom w:type="dxa" w:w="0"/>
-              <w:right w:type="dxa" w:w="0"/>
-            </w:tcMar>
-            <w:vAlign w:val="top"/>
-          </w:tcPr>
-          <w:p>
-            <w:pPr>
-              <w:pBdr>
-                <w:bottom w:val="single" w:color="E9004B" w:sz="8" w:space="1"/>
-              </w:pBdr>
-              <w:spacing w:after="50" w:before="110"/>
-            </w:pPr>
-            <w:r>
-              <w:rPr>
-                <w:rFonts w:ascii="Arial" w:cs="Arial" w:eastAsia="Arial" w:hAnsi="Arial"/>
-                <w:b/>
-                <w:bCs/>
-                <w:color w:val="14284B"/>
-                <w:sz w:val="16"/>
-                <w:szCs w:val="16"/>
-              </w:rPr>
-              <w:t xml:space="preserve">SENSITIVITY ANALYSIS</w:t>
-            </w:r>
-          </w:p>
-          <w:p>
-            <w:pPr>
-              <w:spacing w:after="40" w:before="0" w:line="228" w:lineRule="auto"/>
-              <w:jc w:val="both"/>
-            </w:pPr>
-            <w:r>
-              <w:rPr>
-                <w:rFonts w:ascii="Arial" w:cs="Arial" w:eastAsia="Arial" w:hAnsi="Arial"/>
-                <w:color w:val="1A1A1A"/>
-                <w:sz w:val="16"/>
-                <w:szCs w:val="16"/>
-              </w:rPr>
-              <w:t xml:space="preserve">Value is more sensitive to the discount rate than to operations in the scenarios assessed. The worst operating case, EBITDA margin, takes 10.0% off DCF value (Figure 24), while +100 bp of WACC takes 17.2% off (12.3% of the target price, Figure 25). The current price implies a cap rate close to 6.0%, versus 10.1% in the DCF: the market prices in a low discount rate, which increases the stock's exposure to higher rates. A higher g lowers value because RONIC (5.0%) is below the real WACC (7.2%). The UF barely moves value (+1.1% with UF +3%), as indexed rents offset UF debt. Even the best cell in Figure 25 (CLP 2,487) is below the CLP 3,555 share price, so the recommendation stands.</w:t>
-            </w:r>
-          </w:p>
-        </w:tc>
-        <w:tc>
-          <w:tcPr>
-            <w:tcW w:type="dxa" w:w="216"/>
-            <w:tcBorders>
-              <w:top w:val="none" w:color="FFFFFF" w:sz="0"/>
-              <w:left w:val="none" w:color="FFFFFF" w:sz="0"/>
-              <w:bottom w:val="none" w:color="FFFFFF" w:sz="0"/>
-              <w:right w:val="none" w:color="FFFFFF" w:sz="0"/>
-            </w:tcBorders>
-            <w:tcMar>
-              <w:top w:type="dxa" w:w="0"/>
-              <w:left w:type="dxa" w:w="0"/>
-              <w:bottom w:type="dxa" w:w="0"/>
-              <w:right w:type="dxa" w:w="0"/>
-            </w:tcMar>
-            <w:vAlign w:val="top"/>
-          </w:tcPr>
-          <w:p/>
-        </w:tc>
-        <w:tc>
-          <w:tcPr>
-            <w:tcW w:type="dxa" w:w="3550"/>
-            <w:tcBorders>
-              <w:top w:val="none" w:color="FFFFFF" w:sz="0"/>
-              <w:left w:val="none" w:color="FFFFFF" w:sz="0"/>
-              <w:bottom w:val="none" w:color="FFFFFF" w:sz="0"/>
-              <w:right w:val="none" w:color="FFFFFF" w:sz="0"/>
-            </w:tcBorders>
-            <w:tcMar>
-              <w:top w:type="dxa" w:w="0"/>
-              <w:left w:type="dxa" w:w="0"/>
-              <w:bottom w:type="dxa" w:w="0"/>
-              <w:right w:type="dxa" w:w="0"/>
-            </w:tcMar>
-            <w:vAlign w:val="top"/>
-          </w:tcPr>
-          <w:p>
-            <w:pPr>
-              <w:spacing w:after="30" w:before="40" w:line="228" w:lineRule="auto"/>
+          <w:p>
+            <w:pPr>
+              <w:spacing w:after="30" w:before="100" w:line="228" w:lineRule="auto"/>
             </w:pPr>
             <w:r>
               <w:rPr>
@@ -1210,7 +1095,7 @@
             <w:r>
               <w:drawing>
                 <wp:inline distT="0" distB="0" distL="0" distR="0">
-                  <wp:extent cx="2257425" cy="1371600"/>
+                  <wp:extent cx="2257425" cy="1276350"/>
                   <wp:effectExtent t="0" r="0" b="0" l="0"/>
                   <wp:docPr id="1" name="" descr="" title=""/>
                   <wp:cNvGraphicFramePr>
@@ -1235,7 +1120,7 @@
                         <pic:spPr bwMode="auto">
                           <a:xfrm>
                             <a:off x="0" y="0"/>
-                            <a:ext cx="2257425" cy="1371600"/>
+                            <a:ext cx="2257425" cy="1276350"/>
                           </a:xfrm>
                           <a:prstGeom prst="rect">
                             <a:avLst/>
@@ -1259,755 +1144,12 @@
                 <w:sz w:val="11"/>
                 <w:szCs w:val="11"/>
               </w:rPr>
-              <w:t xml:space="preserve">UF level shock from 2027E, with WACC and g constant. Rents: model's Chile CPI (80% of the target price via DCF); debt: net UF exposure implied by Note 26 (CLP 1.29 trillion). Earnings: +3% reported, +1% and +2% linear extrapolation. Source: Mallplaza financial statements Jun-26, Note 26; Team analysis.</w:t>
+              <w:t xml:space="preserve">UF level shock from 2027E; WACC and g constant. Debt: net UF exposure from Note 26. Earnings: +3% reported; +1% and +2% extrapolated. Source: financial statements Jun-26, Note 26; Team analysis.</w:t>
             </w:r>
           </w:p>
         </w:tc>
       </w:tr>
     </w:tbl>
-    <w:p>
-      <w:pPr>
-        <w:pBdr>
-          <w:bottom w:val="single" w:color="E9004B" w:sz="8" w:space="1"/>
-        </w:pBdr>
-        <w:spacing w:after="50" w:before="110"/>
-      </w:pPr>
-      <w:r>
-        <w:rPr>
-          <w:rFonts w:ascii="Arial" w:cs="Arial" w:eastAsia="Arial" w:hAnsi="Arial"/>
-          <w:b/>
-          <w:bCs/>
-          <w:color w:val="14284B"/>
-          <w:sz w:val="16"/>
-          <w:szCs w:val="16"/>
-        </w:rPr>
-        <w:t xml:space="preserve">POLITICAL AND ECONOMIC CONTEXT 2026</w:t>
-      </w:r>
-    </w:p>
-    <w:tbl>
-      <w:tblPr>
-        <w:tblW w:type="dxa" w:w="10666"/>
-        <w:tblBorders>
-          <w:top w:val="single" w:color="auto" w:sz="4"/>
-          <w:left w:val="single" w:color="auto" w:sz="4"/>
-          <w:bottom w:val="single" w:color="auto" w:sz="4"/>
-          <w:right w:val="single" w:color="auto" w:sz="4"/>
-          <w:insideH w:val="single" w:color="auto" w:sz="4"/>
-          <w:insideV w:val="single" w:color="auto" w:sz="4"/>
-        </w:tblBorders>
-      </w:tblPr>
-      <w:tblGrid>
-        <w:gridCol w:w="1300"/>
-        <w:gridCol w:w="1700"/>
-        <w:gridCol w:w="4250"/>
-        <w:gridCol w:w="3416"/>
-      </w:tblGrid>
-      <w:tr>
-        <w:trPr>
-          <w:tblHeader/>
-        </w:trPr>
-        <w:tc>
-          <w:tcPr>
-            <w:tcW w:type="dxa" w:w="1300"/>
-            <w:tcBorders>
-              <w:top w:val="single" w:color="D5D9E0" w:sz="4"/>
-              <w:left w:val="none" w:color="FFFFFF" w:sz="0"/>
-              <w:bottom w:val="single" w:color="D5D9E0" w:sz="4"/>
-              <w:right w:val="none" w:color="FFFFFF" w:sz="0"/>
-            </w:tcBorders>
-            <w:shd w:fill="14284B" w:color="auto" w:val="clear"/>
-            <w:tcMar>
-              <w:top w:type="dxa" w:w="40"/>
-              <w:left w:type="dxa" w:w="70"/>
-              <w:bottom w:type="dxa" w:w="40"/>
-              <w:right w:type="dxa" w:w="70"/>
-            </w:tcMar>
-            <w:vAlign w:val="top"/>
-          </w:tcPr>
-          <w:p>
-            <w:pPr>
-              <w:spacing w:after="0" w:before="0" w:line="216" w:lineRule="auto"/>
-              <w:jc w:val="left"/>
-            </w:pPr>
-            <w:r>
-              <w:rPr>
-                <w:rFonts w:ascii="Arial" w:cs="Arial" w:eastAsia="Arial" w:hAnsi="Arial"/>
-                <w:b/>
-                <w:bCs/>
-                <w:color w:val="FFFFFF"/>
-                <w:sz w:val="14"/>
-                <w:szCs w:val="14"/>
-              </w:rPr>
-              <w:t xml:space="preserve">Country</w:t>
-            </w:r>
-          </w:p>
-        </w:tc>
-        <w:tc>
-          <w:tcPr>
-            <w:tcW w:type="dxa" w:w="1700"/>
-            <w:tcBorders>
-              <w:top w:val="single" w:color="D5D9E0" w:sz="4"/>
-              <w:left w:val="none" w:color="FFFFFF" w:sz="0"/>
-              <w:bottom w:val="single" w:color="D5D9E0" w:sz="4"/>
-              <w:right w:val="none" w:color="FFFFFF" w:sz="0"/>
-            </w:tcBorders>
-            <w:shd w:fill="14284B" w:color="auto" w:val="clear"/>
-            <w:tcMar>
-              <w:top w:type="dxa" w:w="40"/>
-              <w:left w:type="dxa" w:w="70"/>
-              <w:bottom w:type="dxa" w:w="40"/>
-              <w:right w:type="dxa" w:w="70"/>
-            </w:tcMar>
-            <w:vAlign w:val="top"/>
-          </w:tcPr>
-          <w:p>
-            <w:pPr>
-              <w:spacing w:after="0" w:before="0" w:line="216" w:lineRule="auto"/>
-              <w:jc w:val="left"/>
-            </w:pPr>
-            <w:r>
-              <w:rPr>
-                <w:rFonts w:ascii="Arial" w:cs="Arial" w:eastAsia="Arial" w:hAnsi="Arial"/>
-                <w:b/>
-                <w:bCs/>
-                <w:color w:val="FFFFFF"/>
-                <w:sz w:val="14"/>
-                <w:szCs w:val="14"/>
-              </w:rPr>
-              <w:t xml:space="preserve">Government</w:t>
-            </w:r>
-          </w:p>
-        </w:tc>
-        <w:tc>
-          <w:tcPr>
-            <w:tcW w:type="dxa" w:w="4250"/>
-            <w:tcBorders>
-              <w:top w:val="single" w:color="D5D9E0" w:sz="4"/>
-              <w:left w:val="none" w:color="FFFFFF" w:sz="0"/>
-              <w:bottom w:val="single" w:color="D5D9E0" w:sz="4"/>
-              <w:right w:val="none" w:color="FFFFFF" w:sz="0"/>
-            </w:tcBorders>
-            <w:shd w:fill="14284B" w:color="auto" w:val="clear"/>
-            <w:tcMar>
-              <w:top w:type="dxa" w:w="40"/>
-              <w:left w:type="dxa" w:w="70"/>
-              <w:bottom w:type="dxa" w:w="40"/>
-              <w:right w:type="dxa" w:w="70"/>
-            </w:tcMar>
-            <w:vAlign w:val="top"/>
-          </w:tcPr>
-          <w:p>
-            <w:pPr>
-              <w:spacing w:after="0" w:before="0" w:line="216" w:lineRule="auto"/>
-              <w:jc w:val="left"/>
-            </w:pPr>
-            <w:r>
-              <w:rPr>
-                <w:rFonts w:ascii="Arial" w:cs="Arial" w:eastAsia="Arial" w:hAnsi="Arial"/>
-                <w:b/>
-                <w:bCs/>
-                <w:color w:val="FFFFFF"/>
-                <w:sz w:val="14"/>
-                <w:szCs w:val="14"/>
-              </w:rPr>
-              <w:t xml:space="preserve">Measures and signals</w:t>
-            </w:r>
-          </w:p>
-        </w:tc>
-        <w:tc>
-          <w:tcPr>
-            <w:tcW w:type="dxa" w:w="3416"/>
-            <w:tcBorders>
-              <w:top w:val="single" w:color="D5D9E0" w:sz="4"/>
-              <w:left w:val="none" w:color="FFFFFF" w:sz="0"/>
-              <w:bottom w:val="single" w:color="D5D9E0" w:sz="4"/>
-              <w:right w:val="none" w:color="FFFFFF" w:sz="0"/>
-            </w:tcBorders>
-            <w:shd w:fill="14284B" w:color="auto" w:val="clear"/>
-            <w:tcMar>
-              <w:top w:type="dxa" w:w="40"/>
-              <w:left w:type="dxa" w:w="70"/>
-              <w:bottom w:type="dxa" w:w="40"/>
-              <w:right w:type="dxa" w:w="70"/>
-            </w:tcMar>
-            <w:vAlign w:val="top"/>
-          </w:tcPr>
-          <w:p>
-            <w:pPr>
-              <w:spacing w:after="0" w:before="0" w:line="216" w:lineRule="auto"/>
-              <w:jc w:val="left"/>
-            </w:pPr>
-            <w:r>
-              <w:rPr>
-                <w:rFonts w:ascii="Arial" w:cs="Arial" w:eastAsia="Arial" w:hAnsi="Arial"/>
-                <w:b/>
-                <w:bCs/>
-                <w:color w:val="FFFFFF"/>
-                <w:sz w:val="14"/>
-                <w:szCs w:val="14"/>
-              </w:rPr>
-              <w:t xml:space="preserve">Implication for Mallplaza</w:t>
-            </w:r>
-          </w:p>
-        </w:tc>
-      </w:tr>
-      <w:tr>
-        <w:trPr>
-          <w:cantSplit/>
-        </w:trPr>
-        <w:tc>
-          <w:tcPr>
-            <w:tcW w:type="dxa" w:w="1300"/>
-            <w:tcBorders>
-              <w:top w:val="single" w:color="D5D9E0" w:sz="4"/>
-              <w:left w:val="none" w:color="FFFFFF" w:sz="0"/>
-              <w:bottom w:val="single" w:color="D5D9E0" w:sz="4"/>
-              <w:right w:val="none" w:color="FFFFFF" w:sz="0"/>
-            </w:tcBorders>
-            <w:tcMar>
-              <w:top w:type="dxa" w:w="40"/>
-              <w:left w:type="dxa" w:w="70"/>
-              <w:bottom w:type="dxa" w:w="40"/>
-              <w:right w:type="dxa" w:w="70"/>
-            </w:tcMar>
-            <w:vAlign w:val="top"/>
-          </w:tcPr>
-          <w:p>
-            <w:pPr>
-              <w:spacing w:after="0" w:before="0" w:line="216" w:lineRule="auto"/>
-              <w:jc w:val="left"/>
-            </w:pPr>
-            <w:r>
-              <w:rPr>
-                <w:rFonts w:ascii="Arial" w:cs="Arial" w:eastAsia="Arial" w:hAnsi="Arial"/>
-                <w:b/>
-                <w:bCs/>
-                <w:color w:val="1A1A1A"/>
-                <w:sz w:val="14"/>
-                <w:szCs w:val="14"/>
-              </w:rPr>
-              <w:t xml:space="preserve">Chile</w:t>
-            </w:r>
-          </w:p>
-          <w:p>
-            <w:pPr>
-              <w:spacing w:after="0" w:before="0" w:line="216" w:lineRule="auto"/>
-              <w:jc w:val="left"/>
-            </w:pPr>
-            <w:r>
-              <w:rPr>
-                <w:rFonts w:ascii="Arial" w:cs="Arial" w:eastAsia="Arial" w:hAnsi="Arial"/>
-                <w:b w:val="false"/>
-                <w:bCs w:val="false"/>
-                <w:color w:val="5F5F5F"/>
-                <w:sz w:val="13"/>
-                <w:szCs w:val="13"/>
-              </w:rPr>
-              <w:t xml:space="preserve">~71% of revenue</w:t>
-            </w:r>
-          </w:p>
-        </w:tc>
-        <w:tc>
-          <w:tcPr>
-            <w:tcW w:type="dxa" w:w="1700"/>
-            <w:tcBorders>
-              <w:top w:val="single" w:color="D5D9E0" w:sz="4"/>
-              <w:left w:val="none" w:color="FFFFFF" w:sz="0"/>
-              <w:bottom w:val="single" w:color="D5D9E0" w:sz="4"/>
-              <w:right w:val="none" w:color="FFFFFF" w:sz="0"/>
-            </w:tcBorders>
-            <w:tcMar>
-              <w:top w:type="dxa" w:w="40"/>
-              <w:left w:type="dxa" w:w="70"/>
-              <w:bottom w:type="dxa" w:w="40"/>
-              <w:right w:type="dxa" w:w="70"/>
-            </w:tcMar>
-            <w:vAlign w:val="top"/>
-          </w:tcPr>
-          <w:p>
-            <w:pPr>
-              <w:spacing w:after="0" w:before="0" w:line="216" w:lineRule="auto"/>
-              <w:jc w:val="left"/>
-            </w:pPr>
-            <w:r>
-              <w:rPr>
-                <w:rFonts w:ascii="Arial" w:cs="Arial" w:eastAsia="Arial" w:hAnsi="Arial"/>
-                <w:b/>
-                <w:bCs/>
-                <w:color w:val="1A1A1A"/>
-                <w:sz w:val="14"/>
-                <w:szCs w:val="14"/>
-              </w:rPr>
-              <w:t xml:space="preserve">José Antonio Kast</w:t>
-            </w:r>
-          </w:p>
-          <w:p>
-            <w:pPr>
-              <w:spacing w:after="0" w:before="0" w:line="216" w:lineRule="auto"/>
-              <w:jc w:val="left"/>
-            </w:pPr>
-            <w:r>
-              <w:rPr>
-                <w:rFonts w:ascii="Arial" w:cs="Arial" w:eastAsia="Arial" w:hAnsi="Arial"/>
-                <w:b w:val="false"/>
-                <w:bCs w:val="false"/>
-                <w:color w:val="5F5F5F"/>
-                <w:sz w:val="13"/>
-                <w:szCs w:val="13"/>
-              </w:rPr>
-              <w:t xml:space="preserve">(since Mar-26)</w:t>
-            </w:r>
-          </w:p>
-        </w:tc>
-        <w:tc>
-          <w:tcPr>
-            <w:tcW w:type="dxa" w:w="4250"/>
-            <w:tcBorders>
-              <w:top w:val="single" w:color="D5D9E0" w:sz="4"/>
-              <w:left w:val="none" w:color="FFFFFF" w:sz="0"/>
-              <w:bottom w:val="single" w:color="D5D9E0" w:sz="4"/>
-              <w:right w:val="none" w:color="FFFFFF" w:sz="0"/>
-            </w:tcBorders>
-            <w:tcMar>
-              <w:top w:type="dxa" w:w="40"/>
-              <w:left w:type="dxa" w:w="70"/>
-              <w:bottom w:type="dxa" w:w="40"/>
-              <w:right w:type="dxa" w:w="70"/>
-            </w:tcMar>
-            <w:vAlign w:val="top"/>
-          </w:tcPr>
-          <w:p>
-            <w:pPr>
-              <w:spacing w:after="0" w:before="0" w:line="216" w:lineRule="auto"/>
-              <w:jc w:val="both"/>
-            </w:pPr>
-            <w:r>
-              <w:rPr>
-                <w:rFonts w:ascii="Arial" w:cs="Arial" w:eastAsia="Arial" w:hAnsi="Arial"/>
-                <w:b w:val="false"/>
-                <w:bCs w:val="false"/>
-                <w:color w:val="1A1A1A"/>
-                <w:sz w:val="14"/>
-                <w:szCs w:val="14"/>
-              </w:rPr>
-              <w:t xml:space="preserve">Signed the Reconstruction Law (9-Oct-26): corporate tax from 27% to 23% gradually from 2027 and tax invariability [1]. 2027 budget with spending +2.7% vs the 2026 law [2]. S&amp;P affirmed A stable (Sep-26) [3]. Policy rate 4.5% [4]. Stable Senate, fragile lower house [5].</w:t>
-            </w:r>
-          </w:p>
-        </w:tc>
-        <w:tc>
-          <w:tcPr>
-            <w:tcW w:type="dxa" w:w="3416"/>
-            <w:tcBorders>
-              <w:top w:val="single" w:color="D5D9E0" w:sz="4"/>
-              <w:left w:val="none" w:color="FFFFFF" w:sz="0"/>
-              <w:bottom w:val="single" w:color="D5D9E0" w:sz="4"/>
-              <w:right w:val="none" w:color="FFFFFF" w:sz="0"/>
-            </w:tcBorders>
-            <w:tcMar>
-              <w:top w:type="dxa" w:w="40"/>
-              <w:left w:type="dxa" w:w="70"/>
-              <w:bottom w:type="dxa" w:w="40"/>
-              <w:right w:type="dxa" w:w="70"/>
-            </w:tcMar>
-            <w:vAlign w:val="top"/>
-          </w:tcPr>
-          <w:p>
-            <w:pPr>
-              <w:spacing w:after="0" w:before="0" w:line="216" w:lineRule="auto"/>
-              <w:jc w:val="both"/>
-            </w:pPr>
-            <w:r>
-              <w:rPr>
-                <w:rFonts w:ascii="Arial" w:cs="Arial" w:eastAsia="Arial" w:hAnsi="Arial"/>
-                <w:b w:val="false"/>
-                <w:bCs w:val="false"/>
-                <w:color w:val="1A1A1A"/>
-                <w:sz w:val="14"/>
-                <w:szCs w:val="14"/>
-              </w:rPr>
-              <w:t xml:space="preserve">Positive: lower tax (+3.9% on the target price if applied, not included) and faster permits (Law 21,770). Risk: passing the rest of the agenda depends on a lower house without a comfortable majority.</w:t>
-            </w:r>
-          </w:p>
-        </w:tc>
-      </w:tr>
-      <w:tr>
-        <w:trPr>
-          <w:cantSplit/>
-        </w:trPr>
-        <w:tc>
-          <w:tcPr>
-            <w:tcW w:type="dxa" w:w="1300"/>
-            <w:tcBorders>
-              <w:top w:val="single" w:color="D5D9E0" w:sz="4"/>
-              <w:left w:val="none" w:color="FFFFFF" w:sz="0"/>
-              <w:bottom w:val="single" w:color="D5D9E0" w:sz="4"/>
-              <w:right w:val="none" w:color="FFFFFF" w:sz="0"/>
-            </w:tcBorders>
-            <w:shd w:fill="EEF1F6" w:color="auto" w:val="clear"/>
-            <w:tcMar>
-              <w:top w:type="dxa" w:w="40"/>
-              <w:left w:type="dxa" w:w="70"/>
-              <w:bottom w:type="dxa" w:w="40"/>
-              <w:right w:type="dxa" w:w="70"/>
-            </w:tcMar>
-            <w:vAlign w:val="top"/>
-          </w:tcPr>
-          <w:p>
-            <w:pPr>
-              <w:spacing w:after="0" w:before="0" w:line="216" w:lineRule="auto"/>
-              <w:jc w:val="left"/>
-            </w:pPr>
-            <w:r>
-              <w:rPr>
-                <w:rFonts w:ascii="Arial" w:cs="Arial" w:eastAsia="Arial" w:hAnsi="Arial"/>
-                <w:b/>
-                <w:bCs/>
-                <w:color w:val="1A1A1A"/>
-                <w:sz w:val="14"/>
-                <w:szCs w:val="14"/>
-              </w:rPr>
-              <w:t xml:space="preserve">Peru</w:t>
-            </w:r>
-          </w:p>
-          <w:p>
-            <w:pPr>
-              <w:spacing w:after="0" w:before="0" w:line="216" w:lineRule="auto"/>
-              <w:jc w:val="left"/>
-            </w:pPr>
-            <w:r>
-              <w:rPr>
-                <w:rFonts w:ascii="Arial" w:cs="Arial" w:eastAsia="Arial" w:hAnsi="Arial"/>
-                <w:b w:val="false"/>
-                <w:bCs w:val="false"/>
-                <w:color w:val="5F5F5F"/>
-                <w:sz w:val="13"/>
-                <w:szCs w:val="13"/>
-              </w:rPr>
-              <w:t xml:space="preserve">~19% of revenue</w:t>
-            </w:r>
-          </w:p>
-        </w:tc>
-        <w:tc>
-          <w:tcPr>
-            <w:tcW w:type="dxa" w:w="1700"/>
-            <w:tcBorders>
-              <w:top w:val="single" w:color="D5D9E0" w:sz="4"/>
-              <w:left w:val="none" w:color="FFFFFF" w:sz="0"/>
-              <w:bottom w:val="single" w:color="D5D9E0" w:sz="4"/>
-              <w:right w:val="none" w:color="FFFFFF" w:sz="0"/>
-            </w:tcBorders>
-            <w:shd w:fill="EEF1F6" w:color="auto" w:val="clear"/>
-            <w:tcMar>
-              <w:top w:type="dxa" w:w="40"/>
-              <w:left w:type="dxa" w:w="70"/>
-              <w:bottom w:type="dxa" w:w="40"/>
-              <w:right w:type="dxa" w:w="70"/>
-            </w:tcMar>
-            <w:vAlign w:val="top"/>
-          </w:tcPr>
-          <w:p>
-            <w:pPr>
-              <w:spacing w:after="0" w:before="0" w:line="216" w:lineRule="auto"/>
-              <w:jc w:val="left"/>
-            </w:pPr>
-            <w:r>
-              <w:rPr>
-                <w:rFonts w:ascii="Arial" w:cs="Arial" w:eastAsia="Arial" w:hAnsi="Arial"/>
-                <w:b/>
-                <w:bCs/>
-                <w:color w:val="1A1A1A"/>
-                <w:sz w:val="14"/>
-                <w:szCs w:val="14"/>
-              </w:rPr>
-              <w:t xml:space="preserve">Keiko Fujimori</w:t>
-            </w:r>
-          </w:p>
-          <w:p>
-            <w:pPr>
-              <w:spacing w:after="0" w:before="0" w:line="216" w:lineRule="auto"/>
-              <w:jc w:val="left"/>
-            </w:pPr>
-            <w:r>
-              <w:rPr>
-                <w:rFonts w:ascii="Arial" w:cs="Arial" w:eastAsia="Arial" w:hAnsi="Arial"/>
-                <w:b w:val="false"/>
-                <w:bCs w:val="false"/>
-                <w:color w:val="5F5F5F"/>
-                <w:sz w:val="13"/>
-                <w:szCs w:val="13"/>
-              </w:rPr>
-              <w:t xml:space="preserve">(since 28-Jul-26)</w:t>
-            </w:r>
-          </w:p>
-        </w:tc>
-        <w:tc>
-          <w:tcPr>
-            <w:tcW w:type="dxa" w:w="4250"/>
-            <w:tcBorders>
-              <w:top w:val="single" w:color="D5D9E0" w:sz="4"/>
-              <w:left w:val="none" w:color="FFFFFF" w:sz="0"/>
-              <w:bottom w:val="single" w:color="D5D9E0" w:sz="4"/>
-              <w:right w:val="none" w:color="FFFFFF" w:sz="0"/>
-            </w:tcBorders>
-            <w:shd w:fill="EEF1F6" w:color="auto" w:val="clear"/>
-            <w:tcMar>
-              <w:top w:type="dxa" w:w="40"/>
-              <w:left w:type="dxa" w:w="70"/>
-              <w:bottom w:type="dxa" w:w="40"/>
-              <w:right w:type="dxa" w:w="70"/>
-            </w:tcMar>
-            <w:vAlign w:val="top"/>
-          </w:tcPr>
-          <w:p>
-            <w:pPr>
-              <w:spacing w:after="0" w:before="0" w:line="216" w:lineRule="auto"/>
-              <w:jc w:val="both"/>
-            </w:pPr>
-            <w:r>
-              <w:rPr>
-                <w:rFonts w:ascii="Arial" w:cs="Arial" w:eastAsia="Arial" w:hAnsi="Arial"/>
-                <w:b w:val="false"/>
-                <w:bCs w:val="false"/>
-                <w:color w:val="1A1A1A"/>
-                <w:sz w:val="14"/>
-                <w:szCs w:val="14"/>
-              </w:rPr>
-              <w:t xml:space="preserve">Minimum wage from S/ 1,130 to 1,300 and Pensión 65 doubled (S/ 350 to 700) [6]. 2027 budget of S/ 266,506 million, consistent with a 1.4% of GDP deficit [7]. BCRP holds at 4.25% [8]. Fuerza Popular lacks a majority in the bicameral Congress [9].</w:t>
-            </w:r>
-          </w:p>
-        </w:tc>
-        <w:tc>
-          <w:tcPr>
-            <w:tcW w:type="dxa" w:w="3416"/>
-            <w:tcBorders>
-              <w:top w:val="single" w:color="D5D9E0" w:sz="4"/>
-              <w:left w:val="none" w:color="FFFFFF" w:sz="0"/>
-              <w:bottom w:val="single" w:color="D5D9E0" w:sz="4"/>
-              <w:right w:val="none" w:color="FFFFFF" w:sz="0"/>
-            </w:tcBorders>
-            <w:shd w:fill="EEF1F6" w:color="auto" w:val="clear"/>
-            <w:tcMar>
-              <w:top w:type="dxa" w:w="40"/>
-              <w:left w:type="dxa" w:w="70"/>
-              <w:bottom w:type="dxa" w:w="40"/>
-              <w:right w:type="dxa" w:w="70"/>
-            </w:tcMar>
-            <w:vAlign w:val="top"/>
-          </w:tcPr>
-          <w:p>
-            <w:pPr>
-              <w:spacing w:after="0" w:before="0" w:line="216" w:lineRule="auto"/>
-              <w:jc w:val="both"/>
-            </w:pPr>
-            <w:r>
-              <w:rPr>
-                <w:rFonts w:ascii="Arial" w:cs="Arial" w:eastAsia="Arial" w:hAnsi="Arial"/>
-                <w:b w:val="false"/>
-                <w:bCs w:val="false"/>
-                <w:color w:val="1A1A1A"/>
-                <w:sz w:val="14"/>
-                <w:szCs w:val="14"/>
-              </w:rPr>
-              <w:t xml:space="preserve">Positive for consumption and tenant sales. Risk: governability and the fiscal cost of laws passed by the previous Congress (up to S/ 50,000 million per the MEF) [7].</w:t>
-            </w:r>
-          </w:p>
-        </w:tc>
-      </w:tr>
-      <w:tr>
-        <w:trPr>
-          <w:cantSplit/>
-        </w:trPr>
-        <w:tc>
-          <w:tcPr>
-            <w:tcW w:type="dxa" w:w="1300"/>
-            <w:tcBorders>
-              <w:top w:val="single" w:color="D5D9E0" w:sz="4"/>
-              <w:left w:val="none" w:color="FFFFFF" w:sz="0"/>
-              <w:bottom w:val="single" w:color="D5D9E0" w:sz="4"/>
-              <w:right w:val="none" w:color="FFFFFF" w:sz="0"/>
-            </w:tcBorders>
-            <w:tcMar>
-              <w:top w:type="dxa" w:w="40"/>
-              <w:left w:type="dxa" w:w="70"/>
-              <w:bottom w:type="dxa" w:w="40"/>
-              <w:right w:type="dxa" w:w="70"/>
-            </w:tcMar>
-            <w:vAlign w:val="top"/>
-          </w:tcPr>
-          <w:p>
-            <w:pPr>
-              <w:spacing w:after="0" w:before="0" w:line="216" w:lineRule="auto"/>
-              <w:jc w:val="left"/>
-            </w:pPr>
-            <w:r>
-              <w:rPr>
-                <w:rFonts w:ascii="Arial" w:cs="Arial" w:eastAsia="Arial" w:hAnsi="Arial"/>
-                <w:b/>
-                <w:bCs/>
-                <w:color w:val="1A1A1A"/>
-                <w:sz w:val="14"/>
-                <w:szCs w:val="14"/>
-              </w:rPr>
-              <w:t xml:space="preserve">Colombia</w:t>
-            </w:r>
-          </w:p>
-          <w:p>
-            <w:pPr>
-              <w:spacing w:after="0" w:before="0" w:line="216" w:lineRule="auto"/>
-              <w:jc w:val="left"/>
-            </w:pPr>
-            <w:r>
-              <w:rPr>
-                <w:rFonts w:ascii="Arial" w:cs="Arial" w:eastAsia="Arial" w:hAnsi="Arial"/>
-                <w:b w:val="false"/>
-                <w:bCs w:val="false"/>
-                <w:color w:val="5F5F5F"/>
-                <w:sz w:val="13"/>
-                <w:szCs w:val="13"/>
-              </w:rPr>
-              <w:t xml:space="preserve">~11% of revenue</w:t>
-            </w:r>
-          </w:p>
-        </w:tc>
-        <w:tc>
-          <w:tcPr>
-            <w:tcW w:type="dxa" w:w="1700"/>
-            <w:tcBorders>
-              <w:top w:val="single" w:color="D5D9E0" w:sz="4"/>
-              <w:left w:val="none" w:color="FFFFFF" w:sz="0"/>
-              <w:bottom w:val="single" w:color="D5D9E0" w:sz="4"/>
-              <w:right w:val="none" w:color="FFFFFF" w:sz="0"/>
-            </w:tcBorders>
-            <w:tcMar>
-              <w:top w:type="dxa" w:w="40"/>
-              <w:left w:type="dxa" w:w="70"/>
-              <w:bottom w:type="dxa" w:w="40"/>
-              <w:right w:type="dxa" w:w="70"/>
-            </w:tcMar>
-            <w:vAlign w:val="top"/>
-          </w:tcPr>
-          <w:p>
-            <w:pPr>
-              <w:spacing w:after="0" w:before="0" w:line="216" w:lineRule="auto"/>
-              <w:jc w:val="left"/>
-            </w:pPr>
-            <w:r>
-              <w:rPr>
-                <w:rFonts w:ascii="Arial" w:cs="Arial" w:eastAsia="Arial" w:hAnsi="Arial"/>
-                <w:b/>
-                <w:bCs/>
-                <w:color w:val="1A1A1A"/>
-                <w:sz w:val="14"/>
-                <w:szCs w:val="14"/>
-              </w:rPr>
-              <w:t xml:space="preserve">Abelardo de la Espriella</w:t>
-            </w:r>
-          </w:p>
-          <w:p>
-            <w:pPr>
-              <w:spacing w:after="0" w:before="0" w:line="216" w:lineRule="auto"/>
-              <w:jc w:val="left"/>
-            </w:pPr>
-            <w:r>
-              <w:rPr>
-                <w:rFonts w:ascii="Arial" w:cs="Arial" w:eastAsia="Arial" w:hAnsi="Arial"/>
-                <w:b w:val="false"/>
-                <w:bCs w:val="false"/>
-                <w:color w:val="5F5F5F"/>
-                <w:sz w:val="13"/>
-                <w:szCs w:val="13"/>
-              </w:rPr>
-              <w:t xml:space="preserve">(since 7-Aug-26)</w:t>
-            </w:r>
-          </w:p>
-        </w:tc>
-        <w:tc>
-          <w:tcPr>
-            <w:tcW w:type="dxa" w:w="4250"/>
-            <w:tcBorders>
-              <w:top w:val="single" w:color="D5D9E0" w:sz="4"/>
-              <w:left w:val="none" w:color="FFFFFF" w:sz="0"/>
-              <w:bottom w:val="single" w:color="D5D9E0" w:sz="4"/>
-              <w:right w:val="none" w:color="FFFFFF" w:sz="0"/>
-            </w:tcBorders>
-            <w:tcMar>
-              <w:top w:type="dxa" w:w="40"/>
-              <w:left w:type="dxa" w:w="70"/>
-              <w:bottom w:type="dxa" w:w="40"/>
-              <w:right w:type="dxa" w:w="70"/>
-            </w:tcMar>
-            <w:vAlign w:val="top"/>
-          </w:tcPr>
-          <w:p>
-            <w:pPr>
-              <w:spacing w:after="0" w:before="0" w:line="216" w:lineRule="auto"/>
-              <w:jc w:val="both"/>
-            </w:pPr>
-            <w:r>
-              <w:rPr>
-                <w:rFonts w:ascii="Arial" w:cs="Arial" w:eastAsia="Arial" w:hAnsi="Arial"/>
-                <w:b w:val="false"/>
-                <w:bCs w:val="false"/>
-                <w:color w:val="1A1A1A"/>
-                <w:sz w:val="14"/>
-                <w:szCs w:val="14"/>
-              </w:rPr>
-              <w:t xml:space="preserve">The finance ministry puts the deficit at 7.8% of GDP and proposes spending cuts of at least 1% of GDP [10]; tax reform to lower the corporate burden [11]. The central bank raised its rate to 12.25% (30-Sep-26) [12]. S&amp;P BB- stable [13].</w:t>
-            </w:r>
-          </w:p>
-        </w:tc>
-        <w:tc>
-          <w:tcPr>
-            <w:tcW w:type="dxa" w:w="3416"/>
-            <w:tcBorders>
-              <w:top w:val="single" w:color="D5D9E0" w:sz="4"/>
-              <w:left w:val="none" w:color="FFFFFF" w:sz="0"/>
-              <w:bottom w:val="single" w:color="D5D9E0" w:sz="4"/>
-              <w:right w:val="none" w:color="FFFFFF" w:sz="0"/>
-            </w:tcBorders>
-            <w:tcMar>
-              <w:top w:type="dxa" w:w="40"/>
-              <w:left w:type="dxa" w:w="70"/>
-              <w:bottom w:type="dxa" w:w="40"/>
-              <w:right w:type="dxa" w:w="70"/>
-            </w:tcMar>
-            <w:vAlign w:val="top"/>
-          </w:tcPr>
-          <w:p>
-            <w:pPr>
-              <w:spacing w:after="0" w:before="0" w:line="216" w:lineRule="auto"/>
-              <w:jc w:val="both"/>
-            </w:pPr>
-            <w:r>
-              <w:rPr>
-                <w:rFonts w:ascii="Arial" w:cs="Arial" w:eastAsia="Arial" w:hAnsi="Arial"/>
-                <w:b w:val="false"/>
-                <w:bCs w:val="false"/>
-                <w:color w:val="1A1A1A"/>
-                <w:sz w:val="14"/>
-                <w:szCs w:val="14"/>
-              </w:rPr>
-              <w:t xml:space="preserve">Short-term negative: fiscal tightening and high rates slow consumption and pressure the COP (MR3). Limited weight in value.</w:t>
-            </w:r>
-          </w:p>
-        </w:tc>
-      </w:tr>
-    </w:tbl>
-    <w:p>
-      <w:pPr>
-        <w:spacing w:after="0" w:before="50" w:line="216" w:lineRule="auto"/>
-        <w:jc w:val="both"/>
-      </w:pPr>
-      <w:r>
-        <w:rPr>
-          <w:rFonts w:ascii="Arial" w:cs="Arial" w:eastAsia="Arial" w:hAnsi="Arial"/>
-          <w:color w:val="5F5F5F"/>
-          <w:sz w:val="11"/>
-          <w:szCs w:val="11"/>
-        </w:rPr>
-        <w:t xml:space="preserve">[1] Emol, 9-Oct-26, “Ley de Reconstrucción promulgada”; CNN Chile, Oct-26. [2] Diario Financiero / El Mostrador, 3-Oct-26. [3] Chilean Ministry of Finance, note on Fitch and S&amp;P, Sep-26. [4] Central Bank of Chile, Oct-26 meeting. [5] El Dínamo, 11-Mar-26. [6] Infobae / La República (Peru), 28-Jul-26. [7] Infobae, 29-Aug-26; El Comercio (MEF). [8] Infobae, 11-Sep-26. [9] América TV, 2026. [10] El Tiempo / La Silla Vacía, Jul-26. [11] Valora Analitik / El Colombiano, 2026. [12] Banco de la República, statement 30-Sep-26. [13] IRC – Colombian Ministry of Finance. Revenue shares 2026E: team model. Source: Team analysis.</w:t>
-      </w:r>
-    </w:p>
     <w:sectPr>
       <w:headerReference w:type="default" r:id="rId7"/>
       <w:footerReference w:type="default" r:id="rId8"/>

</xml_diff>